<commit_message>
added analysis + text in word document
</commit_message>
<xml_diff>
--- a/vaccines/World Covid vaccination.docx
+++ b/vaccines/World Covid vaccination.docx
@@ -4764,25 +4764,7 @@
         <w:rPr>
           <w:lang w:val="en-GB"/>
         </w:rPr>
-        <w:t xml:space="preserve">Red line: </w:t>
-      </w:r>
-      <w:r>
-        <w:rPr>
-          <w:lang w:val="en-GB"/>
-        </w:rPr>
-        <w:t>upward slope</w:t>
-      </w:r>
-      <w:r>
-        <w:rPr>
-          <w:lang w:val="en-GB"/>
-        </w:rPr>
-        <w:t>…</w:t>
-      </w:r>
-      <w:r>
-        <w:rPr>
-          <w:lang w:val="en-GB"/>
-        </w:rPr>
-        <w:t>confirms hypothesis</w:t>
+        <w:t>Red line: upward slope…confirms hypothesis</w:t>
       </w:r>
     </w:p>
     <w:p>
@@ -4798,19 +4780,7 @@
         <w:rPr>
           <w:lang w:val="en-GB"/>
         </w:rPr>
-        <w:t>Cluster at low values</w:t>
-      </w:r>
-      <w:r>
-        <w:rPr>
-          <w:lang w:val="en-GB"/>
-        </w:rPr>
-        <w:t>…m</w:t>
-      </w:r>
-      <w:r>
-        <w:rPr>
-          <w:lang w:val="en-GB"/>
-        </w:rPr>
-        <w:t>any countries struggled to scale vaccination campaigns</w:t>
+        <w:t>Cluster at low values…many countries struggled to scale vaccination campaigns</w:t>
       </w:r>
     </w:p>
     <w:p>
@@ -4959,25 +4929,7 @@
         <w:rPr>
           <w:lang w:val="en-GB"/>
         </w:rPr>
-        <w:t xml:space="preserve">countries -&gt; </w:t>
-      </w:r>
-      <w:r>
-        <w:rPr>
-          <w:lang w:val="en-GB"/>
-        </w:rPr>
-        <w:t>smoother distribution</w:t>
-      </w:r>
-      <w:r>
-        <w:rPr>
-          <w:lang w:val="en-GB"/>
-        </w:rPr>
-        <w:t xml:space="preserve">, </w:t>
-      </w:r>
-      <w:r>
-        <w:rPr>
-          <w:lang w:val="en-GB"/>
-        </w:rPr>
-        <w:t>fewer extreme values</w:t>
+        <w:t>countries -&gt; smoother distribution, fewer extreme values</w:t>
       </w:r>
     </w:p>
     <w:p>
@@ -4995,6 +4947,9 @@
         <w:tabs>
           <w:tab w:val="left" w:pos="1267"/>
         </w:tabs>
+        <w:rPr>
+          <w:lang w:val="en-GB"/>
+        </w:rPr>
       </w:pPr>
       <w:r>
         <w:rPr>
@@ -5098,6 +5053,604 @@
           <w:lang w:val="en-GB"/>
         </w:rPr>
       </w:pPr>
+    </w:p>
+    <w:p>
+      <w:pPr>
+        <w:tabs>
+          <w:tab w:val="left" w:pos="1267"/>
+        </w:tabs>
+        <w:rPr>
+          <w:b/>
+          <w:bCs/>
+          <w:lang w:val="en-GB"/>
+        </w:rPr>
+      </w:pPr>
+      <w:r>
+        <w:rPr>
+          <w:lang w:val="en-GB"/>
+        </w:rPr>
+        <w:br w:type="column"/>
+      </w:r>
+      <w:r>
+        <w:rPr>
+          <w:b/>
+          <w:bCs/>
+          <w:lang w:val="en-GB"/>
+        </w:rPr>
+        <w:lastRenderedPageBreak/>
+        <w:t>Dataset</w:t>
+      </w:r>
+      <w:r>
+        <w:rPr>
+          <w:lang w:val="en-GB"/>
+        </w:rPr>
+        <w:t xml:space="preserve"> </w:t>
+      </w:r>
+      <w:r>
+        <w:rPr>
+          <w:b/>
+          <w:bCs/>
+          <w:lang w:val="en-GB"/>
+        </w:rPr>
+        <w:t>Description</w:t>
+      </w:r>
+    </w:p>
+    <w:p>
+      <w:pPr>
+        <w:tabs>
+          <w:tab w:val="left" w:pos="1267"/>
+        </w:tabs>
+        <w:rPr>
+          <w:lang w:val="en-GB"/>
+        </w:rPr>
+      </w:pPr>
+      <w:r>
+        <w:rPr>
+          <w:lang w:val="en-GB"/>
+        </w:rPr>
+        <w:t>The dataset contains daily COVID-19 vaccination records for individual countries. Each row represents one country on a specific date.</w:t>
+      </w:r>
+    </w:p>
+    <w:p>
+      <w:pPr>
+        <w:tabs>
+          <w:tab w:val="left" w:pos="1267"/>
+        </w:tabs>
+        <w:rPr>
+          <w:lang w:val="en-GB"/>
+        </w:rPr>
+      </w:pPr>
+      <w:r>
+        <w:rPr>
+          <w:lang w:val="en-GB"/>
+        </w:rPr>
+        <w:t>The data includes variables related to vaccination progress, such as:</w:t>
+      </w:r>
+    </w:p>
+    <w:p>
+      <w:pPr>
+        <w:numPr>
+          <w:ilvl w:val="0"/>
+          <w:numId w:val="16"/>
+        </w:numPr>
+        <w:tabs>
+          <w:tab w:val="left" w:pos="1267"/>
+        </w:tabs>
+        <w:rPr>
+          <w:lang w:val="en-GB"/>
+        </w:rPr>
+      </w:pPr>
+      <w:r>
+        <w:rPr>
+          <w:lang w:val="en-GB"/>
+        </w:rPr>
+        <w:t xml:space="preserve">total vaccinations, </w:t>
+      </w:r>
+    </w:p>
+    <w:p>
+      <w:pPr>
+        <w:numPr>
+          <w:ilvl w:val="0"/>
+          <w:numId w:val="16"/>
+        </w:numPr>
+        <w:tabs>
+          <w:tab w:val="left" w:pos="1267"/>
+        </w:tabs>
+        <w:rPr>
+          <w:lang w:val="en-GB"/>
+        </w:rPr>
+      </w:pPr>
+      <w:r>
+        <w:rPr>
+          <w:lang w:val="en-GB"/>
+        </w:rPr>
+        <w:t xml:space="preserve">fully vaccinated individuals, </w:t>
+      </w:r>
+    </w:p>
+    <w:p>
+      <w:pPr>
+        <w:numPr>
+          <w:ilvl w:val="0"/>
+          <w:numId w:val="16"/>
+        </w:numPr>
+        <w:tabs>
+          <w:tab w:val="left" w:pos="1267"/>
+        </w:tabs>
+        <w:rPr>
+          <w:lang w:val="en-GB"/>
+        </w:rPr>
+      </w:pPr>
+      <w:r>
+        <w:rPr>
+          <w:lang w:val="en-GB"/>
+        </w:rPr>
+        <w:t xml:space="preserve">booster doses, </w:t>
+      </w:r>
+    </w:p>
+    <w:p>
+      <w:pPr>
+        <w:numPr>
+          <w:ilvl w:val="0"/>
+          <w:numId w:val="16"/>
+        </w:numPr>
+        <w:tabs>
+          <w:tab w:val="left" w:pos="1267"/>
+        </w:tabs>
+        <w:rPr>
+          <w:lang w:val="en-GB"/>
+        </w:rPr>
+      </w:pPr>
+      <w:r>
+        <w:rPr>
+          <w:lang w:val="en-GB"/>
+        </w:rPr>
+        <w:t xml:space="preserve">vaccinations per hundred people, </w:t>
+      </w:r>
+    </w:p>
+    <w:p>
+      <w:pPr>
+        <w:numPr>
+          <w:ilvl w:val="0"/>
+          <w:numId w:val="16"/>
+        </w:numPr>
+        <w:tabs>
+          <w:tab w:val="left" w:pos="1267"/>
+        </w:tabs>
+        <w:rPr>
+          <w:lang w:val="en-GB"/>
+        </w:rPr>
+      </w:pPr>
+      <w:r>
+        <w:rPr>
+          <w:lang w:val="en-GB"/>
+        </w:rPr>
+        <w:t xml:space="preserve">and daily vaccinations per million inhabitants. </w:t>
+      </w:r>
+    </w:p>
+    <w:p>
+      <w:pPr>
+        <w:tabs>
+          <w:tab w:val="left" w:pos="1267"/>
+        </w:tabs>
+        <w:rPr>
+          <w:lang w:val="en-GB"/>
+        </w:rPr>
+      </w:pPr>
+      <w:r>
+        <w:rPr>
+          <w:lang w:val="en-GB"/>
+        </w:rPr>
+        <w:t xml:space="preserve">The dataset contains more than 41,000 observations and 14 variables. Aggregated regions such as </w:t>
+      </w:r>
+      <w:r>
+        <w:rPr>
+          <w:i/>
+          <w:iCs/>
+          <w:lang w:val="en-GB"/>
+        </w:rPr>
+        <w:t>World</w:t>
+      </w:r>
+      <w:r>
+        <w:rPr>
+          <w:lang w:val="en-GB"/>
+        </w:rPr>
+        <w:t xml:space="preserve">, </w:t>
+      </w:r>
+      <w:r>
+        <w:rPr>
+          <w:i/>
+          <w:iCs/>
+          <w:lang w:val="en-GB"/>
+        </w:rPr>
+        <w:t>Europe</w:t>
+      </w:r>
+      <w:r>
+        <w:rPr>
+          <w:lang w:val="en-GB"/>
+        </w:rPr>
+        <w:t>, and income groups were removed to focus only on country-level analysis.</w:t>
+      </w:r>
+    </w:p>
+    <w:p>
+      <w:pPr>
+        <w:tabs>
+          <w:tab w:val="left" w:pos="1267"/>
+        </w:tabs>
+        <w:rPr>
+          <w:lang w:val="en-GB"/>
+        </w:rPr>
+      </w:pPr>
+    </w:p>
+    <w:p>
+      <w:pPr>
+        <w:tabs>
+          <w:tab w:val="left" w:pos="1267"/>
+        </w:tabs>
+        <w:rPr>
+          <w:b/>
+          <w:bCs/>
+          <w:lang w:val="en-GB"/>
+        </w:rPr>
+      </w:pPr>
+      <w:r>
+        <w:rPr>
+          <w:b/>
+          <w:bCs/>
+          <w:lang w:val="en-GB"/>
+        </w:rPr>
+        <w:t>Data Inspection and Cleaning</w:t>
+      </w:r>
+    </w:p>
+    <w:p>
+      <w:pPr>
+        <w:tabs>
+          <w:tab w:val="left" w:pos="1267"/>
+        </w:tabs>
+        <w:rPr>
+          <w:lang w:val="en-GB"/>
+        </w:rPr>
+      </w:pPr>
+      <w:r>
+        <w:rPr>
+          <w:lang w:val="en-GB"/>
+        </w:rPr>
+        <w:t>The dataset was inspected using functions such as summary(), str(), head(), and random sampling.</w:t>
+      </w:r>
+    </w:p>
+    <w:p>
+      <w:pPr>
+        <w:tabs>
+          <w:tab w:val="left" w:pos="1267"/>
+        </w:tabs>
+        <w:rPr>
+          <w:lang w:val="en-GB"/>
+        </w:rPr>
+      </w:pPr>
+      <w:r>
+        <w:rPr>
+          <w:lang w:val="en-GB"/>
+        </w:rPr>
+        <w:t>Several formatting inconsistencies were identified in variables expected to contain numeric values, including values such as:</w:t>
+      </w:r>
+    </w:p>
+    <w:p>
+      <w:pPr>
+        <w:numPr>
+          <w:ilvl w:val="0"/>
+          <w:numId w:val="17"/>
+        </w:numPr>
+        <w:tabs>
+          <w:tab w:val="left" w:pos="1267"/>
+        </w:tabs>
+        <w:rPr>
+          <w:lang w:val="en-GB"/>
+        </w:rPr>
+      </w:pPr>
+      <w:r>
+        <w:rPr>
+          <w:lang w:val="en-GB"/>
+        </w:rPr>
+        <w:t xml:space="preserve">I.32 </w:t>
+      </w:r>
+    </w:p>
+    <w:p>
+      <w:pPr>
+        <w:numPr>
+          <w:ilvl w:val="0"/>
+          <w:numId w:val="17"/>
+        </w:numPr>
+        <w:tabs>
+          <w:tab w:val="left" w:pos="1267"/>
+        </w:tabs>
+        <w:rPr>
+          <w:lang w:val="en-GB"/>
+        </w:rPr>
+      </w:pPr>
+      <w:r>
+        <w:rPr>
+          <w:lang w:val="en-GB"/>
+        </w:rPr>
+        <w:t xml:space="preserve">II.55 </w:t>
+      </w:r>
+    </w:p>
+    <w:p>
+      <w:pPr>
+        <w:numPr>
+          <w:ilvl w:val="0"/>
+          <w:numId w:val="17"/>
+        </w:numPr>
+        <w:tabs>
+          <w:tab w:val="left" w:pos="1267"/>
+        </w:tabs>
+        <w:rPr>
+          <w:lang w:val="en-GB"/>
+        </w:rPr>
+      </w:pPr>
+      <w:r>
+        <w:rPr>
+          <w:lang w:val="en-GB"/>
+        </w:rPr>
+        <w:t xml:space="preserve">01.XII </w:t>
+      </w:r>
+    </w:p>
+    <w:p>
+      <w:pPr>
+        <w:tabs>
+          <w:tab w:val="left" w:pos="1267"/>
+        </w:tabs>
+        <w:rPr>
+          <w:lang w:val="en-GB"/>
+        </w:rPr>
+      </w:pPr>
+      <w:r>
+        <w:rPr>
+          <w:lang w:val="en-GB"/>
+        </w:rPr>
+        <w:t>Vaccination-related variables were converted to numeric format where possible, and dates were transformed into proper date format for time-series analysis.</w:t>
+      </w:r>
+    </w:p>
+    <w:p>
+      <w:pPr>
+        <w:tabs>
+          <w:tab w:val="left" w:pos="1267"/>
+        </w:tabs>
+        <w:rPr>
+          <w:lang w:val="en-GB"/>
+        </w:rPr>
+      </w:pPr>
+      <w:r>
+        <w:rPr>
+          <w:lang w:val="en-GB"/>
+        </w:rPr>
+        <w:t>Missing values were common, especially in booster-related variables. These missing values mainly reflected delayed vaccination rollout or irregular reporting across countries rather than dataset errors.</w:t>
+      </w:r>
+    </w:p>
+    <w:p>
+      <w:pPr>
+        <w:tabs>
+          <w:tab w:val="left" w:pos="1267"/>
+        </w:tabs>
+        <w:rPr>
+          <w:lang w:val="en-GB"/>
+        </w:rPr>
+      </w:pPr>
+    </w:p>
+    <w:p>
+      <w:pPr>
+        <w:tabs>
+          <w:tab w:val="left" w:pos="1267"/>
+        </w:tabs>
+        <w:rPr>
+          <w:b/>
+          <w:bCs/>
+          <w:lang w:val="en-GB"/>
+        </w:rPr>
+      </w:pPr>
+      <w:r>
+        <w:rPr>
+          <w:b/>
+          <w:bCs/>
+          <w:lang w:val="en-GB"/>
+        </w:rPr>
+        <w:t>Exploratory and Comparative Analysis</w:t>
+      </w:r>
+    </w:p>
+    <w:p>
+      <w:pPr>
+        <w:tabs>
+          <w:tab w:val="left" w:pos="1267"/>
+        </w:tabs>
+        <w:rPr>
+          <w:lang w:val="en-GB"/>
+        </w:rPr>
+      </w:pPr>
+      <w:r>
+        <w:rPr>
+          <w:lang w:val="en-GB"/>
+        </w:rPr>
+        <w:t>Time-series visualizations were used to compare vaccination progress between selected countries, including Germany, India, Israel, and the United States.</w:t>
+      </w:r>
+    </w:p>
+    <w:p>
+      <w:pPr>
+        <w:tabs>
+          <w:tab w:val="left" w:pos="1267"/>
+        </w:tabs>
+        <w:rPr>
+          <w:lang w:val="en-GB"/>
+        </w:rPr>
+      </w:pPr>
+      <w:r>
+        <w:rPr>
+          <w:lang w:val="en-GB"/>
+        </w:rPr>
+        <w:t>Normalized indicators such as:</w:t>
+      </w:r>
+    </w:p>
+    <w:p>
+      <w:pPr>
+        <w:numPr>
+          <w:ilvl w:val="0"/>
+          <w:numId w:val="18"/>
+        </w:numPr>
+        <w:tabs>
+          <w:tab w:val="left" w:pos="1267"/>
+        </w:tabs>
+        <w:rPr>
+          <w:lang w:val="en-GB"/>
+        </w:rPr>
+      </w:pPr>
+      <w:r>
+        <w:rPr>
+          <w:lang w:val="en-GB"/>
+        </w:rPr>
+        <w:t xml:space="preserve">fully vaccinated individuals per 100 people, </w:t>
+      </w:r>
+    </w:p>
+    <w:p>
+      <w:pPr>
+        <w:numPr>
+          <w:ilvl w:val="0"/>
+          <w:numId w:val="18"/>
+        </w:numPr>
+        <w:tabs>
+          <w:tab w:val="left" w:pos="1267"/>
+        </w:tabs>
+        <w:rPr>
+          <w:lang w:val="en-GB"/>
+        </w:rPr>
+      </w:pPr>
+      <w:r>
+        <w:rPr>
+          <w:lang w:val="en-GB"/>
+        </w:rPr>
+        <w:t xml:space="preserve">and daily vaccinations per million inhabitants </w:t>
+      </w:r>
+    </w:p>
+    <w:p>
+      <w:pPr>
+        <w:tabs>
+          <w:tab w:val="left" w:pos="1267"/>
+        </w:tabs>
+        <w:rPr>
+          <w:lang w:val="en-GB"/>
+        </w:rPr>
+      </w:pPr>
+      <w:r>
+        <w:rPr>
+          <w:lang w:val="en-GB"/>
+        </w:rPr>
+        <w:t>were used to support fair country comparison.</w:t>
+      </w:r>
+    </w:p>
+    <w:p>
+      <w:pPr>
+        <w:tabs>
+          <w:tab w:val="left" w:pos="1267"/>
+        </w:tabs>
+        <w:rPr>
+          <w:lang w:val="en-GB"/>
+        </w:rPr>
+      </w:pPr>
+      <w:r>
+        <w:rPr>
+          <w:lang w:val="en-GB"/>
+        </w:rPr>
+        <w:t>Country-level summary statistics were calculated using:</w:t>
+      </w:r>
+    </w:p>
+    <w:p>
+      <w:pPr>
+        <w:numPr>
+          <w:ilvl w:val="0"/>
+          <w:numId w:val="19"/>
+        </w:numPr>
+        <w:tabs>
+          <w:tab w:val="left" w:pos="1267"/>
+        </w:tabs>
+        <w:rPr>
+          <w:lang w:val="en-GB"/>
+        </w:rPr>
+      </w:pPr>
+      <w:r>
+        <w:rPr>
+          <w:lang w:val="en-GB"/>
+        </w:rPr>
+        <w:lastRenderedPageBreak/>
+        <w:t xml:space="preserve">maximum vaccination coverage, </w:t>
+      </w:r>
+    </w:p>
+    <w:p>
+      <w:pPr>
+        <w:numPr>
+          <w:ilvl w:val="0"/>
+          <w:numId w:val="19"/>
+        </w:numPr>
+        <w:tabs>
+          <w:tab w:val="left" w:pos="1267"/>
+        </w:tabs>
+        <w:rPr>
+          <w:lang w:val="en-GB"/>
+        </w:rPr>
+      </w:pPr>
+      <w:r>
+        <w:rPr>
+          <w:lang w:val="en-GB"/>
+        </w:rPr>
+        <w:t xml:space="preserve">peak vaccination speed, </w:t>
+      </w:r>
+    </w:p>
+    <w:p>
+      <w:pPr>
+        <w:numPr>
+          <w:ilvl w:val="0"/>
+          <w:numId w:val="19"/>
+        </w:numPr>
+        <w:tabs>
+          <w:tab w:val="left" w:pos="1267"/>
+        </w:tabs>
+        <w:rPr>
+          <w:lang w:val="en-GB"/>
+        </w:rPr>
+      </w:pPr>
+      <w:r>
+        <w:rPr>
+          <w:lang w:val="en-GB"/>
+        </w:rPr>
+        <w:t xml:space="preserve">and total vaccination counts. </w:t>
+      </w:r>
+    </w:p>
+    <w:p>
+      <w:pPr>
+        <w:tabs>
+          <w:tab w:val="left" w:pos="1267"/>
+        </w:tabs>
+        <w:rPr>
+          <w:lang w:val="en-GB"/>
+        </w:rPr>
+      </w:pPr>
+      <w:r>
+        <w:rPr>
+          <w:lang w:val="en-GB"/>
+        </w:rPr>
+        <w:t>Scatter plots, ranking visualizations, and a linear regression model were used to examine the relationship between vaccination speed and vaccination coverage across countries.</w:t>
+      </w:r>
+    </w:p>
+    <w:p>
+      <w:pPr>
+        <w:tabs>
+          <w:tab w:val="left" w:pos="1267"/>
+        </w:tabs>
+        <w:rPr>
+          <w:lang w:val="en-GB"/>
+        </w:rPr>
+      </w:pPr>
+      <w:r>
+        <w:rPr>
+          <w:lang w:val="en-GB"/>
+        </w:rPr>
+        <w:t>The regression analysis showed a statistically significant positive relationship between vaccination speed and final vaccination coverage, although additional country-specific factors likely also influenced vaccination outcomes.</w:t>
+      </w:r>
     </w:p>
     <w:p>
       <w:pPr>
@@ -5172,6 +5725,304 @@
 <file path=word/numbering.xml><?xml version="1.0" encoding="utf-8"?>
 <w:numbering xmlns:wpc="http://schemas.microsoft.com/office/word/2010/wordprocessingCanvas" xmlns:cx="http://schemas.microsoft.com/office/drawing/2014/chartex" xmlns:cx1="http://schemas.microsoft.com/office/drawing/2015/9/8/chartex" xmlns:cx2="http://schemas.microsoft.com/office/drawing/2015/10/21/chartex" xmlns:cx3="http://schemas.microsoft.com/office/drawing/2016/5/9/chartex" xmlns:cx4="http://schemas.microsoft.com/office/drawing/2016/5/10/chartex" xmlns:cx5="http://schemas.microsoft.com/office/drawing/2016/5/11/chartex" xmlns:cx6="http://schemas.microsoft.com/office/drawing/2016/5/12/chartex" xmlns:cx7="http://schemas.microsoft.com/office/drawing/2016/5/13/chartex" xmlns:cx8="http://schemas.microsoft.com/office/drawing/2016/5/14/chartex" xmlns:mc="http://schemas.openxmlformats.org/markup-compatibility/2006" xmlns:aink="http://schemas.microsoft.com/office/drawing/2016/ink" xmlns:am3d="http://schemas.microsoft.com/office/drawing/2017/model3d" xmlns:o="urn:schemas-microsoft-com:office:office" xmlns:oel="http://schemas.microsoft.com/office/2019/extlst" xmlns:r="http://schemas.openxmlformats.org/officeDocument/2006/relationships" xmlns:m="http://schemas.openxmlformats.org/officeDocument/2006/math" xmlns:v="urn:schemas-microsoft-com:vml" xmlns:wp14="http://schemas.microsoft.com/office/word/2010/wordprocessingDrawing" xmlns:wp="http://schemas.openxmlformats.org/drawingml/2006/wordprocessingDrawing" xmlns:w10="urn:schemas-microsoft-com:office:word" xmlns:w="http://schemas.openxmlformats.org/wordprocessingml/2006/main" xmlns:w14="http://schemas.microsoft.com/office/word/2010/wordml" xmlns:w15="http://schemas.microsoft.com/office/word/2012/wordml" xmlns:w16cex="http://schemas.microsoft.com/office/word/2018/wordml/cex" xmlns:w16cid="http://schemas.microsoft.com/office/word/2016/wordml/cid" xmlns:w16="http://schemas.microsoft.com/office/word/2018/wordml" xmlns:w16du="http://schemas.microsoft.com/office/word/2023/wordml/word16du" xmlns:w16sdtdh="http://schemas.microsoft.com/office/word/2020/wordml/sdtdatahash" xmlns:w16sdtfl="http://schemas.microsoft.com/office/word/2024/wordml/sdtformatlock" xmlns:w16se="http://schemas.microsoft.com/office/word/2015/wordml/symex" xmlns:wpg="http://schemas.microsoft.com/office/word/2010/wordprocessingGroup" xmlns:wpi="http://schemas.microsoft.com/office/word/2010/wordprocessingInk" xmlns:wne="http://schemas.microsoft.com/office/word/2006/wordml" xmlns:wps="http://schemas.microsoft.com/office/word/2010/wordprocessingShape" mc:Ignorable="w14 w15 w16se w16cid w16 w16cex w16sdtdh w16sdtfl w16du wp14">
   <w:abstractNum w:abstractNumId="0" w15:restartNumberingAfterBreak="0">
+    <w:nsid w:val="03E50B6E"/>
+    <w:multiLevelType w:val="multilevel"/>
+    <w:tmpl w:val="341C8568"/>
+    <w:lvl w:ilvl="0">
+      <w:start w:val="1"/>
+      <w:numFmt w:val="bullet"/>
+      <w:lvlText w:val=""/>
+      <w:lvlJc w:val="left"/>
+      <w:pPr>
+        <w:tabs>
+          <w:tab w:val="num" w:pos="720"/>
+        </w:tabs>
+        <w:ind w:left="720" w:hanging="360"/>
+      </w:pPr>
+      <w:rPr>
+        <w:rFonts w:ascii="Symbol" w:hAnsi="Symbol" w:hint="default"/>
+        <w:sz w:val="20"/>
+      </w:rPr>
+    </w:lvl>
+    <w:lvl w:ilvl="1" w:tentative="1">
+      <w:start w:val="1"/>
+      <w:numFmt w:val="bullet"/>
+      <w:lvlText w:val="o"/>
+      <w:lvlJc w:val="left"/>
+      <w:pPr>
+        <w:tabs>
+          <w:tab w:val="num" w:pos="1440"/>
+        </w:tabs>
+        <w:ind w:left="1440" w:hanging="360"/>
+      </w:pPr>
+      <w:rPr>
+        <w:rFonts w:ascii="Courier New" w:hAnsi="Courier New" w:hint="default"/>
+        <w:sz w:val="20"/>
+      </w:rPr>
+    </w:lvl>
+    <w:lvl w:ilvl="2" w:tentative="1">
+      <w:start w:val="1"/>
+      <w:numFmt w:val="bullet"/>
+      <w:lvlText w:val=""/>
+      <w:lvlJc w:val="left"/>
+      <w:pPr>
+        <w:tabs>
+          <w:tab w:val="num" w:pos="2160"/>
+        </w:tabs>
+        <w:ind w:left="2160" w:hanging="360"/>
+      </w:pPr>
+      <w:rPr>
+        <w:rFonts w:ascii="Wingdings" w:hAnsi="Wingdings" w:hint="default"/>
+        <w:sz w:val="20"/>
+      </w:rPr>
+    </w:lvl>
+    <w:lvl w:ilvl="3" w:tentative="1">
+      <w:start w:val="1"/>
+      <w:numFmt w:val="bullet"/>
+      <w:lvlText w:val=""/>
+      <w:lvlJc w:val="left"/>
+      <w:pPr>
+        <w:tabs>
+          <w:tab w:val="num" w:pos="2880"/>
+        </w:tabs>
+        <w:ind w:left="2880" w:hanging="360"/>
+      </w:pPr>
+      <w:rPr>
+        <w:rFonts w:ascii="Wingdings" w:hAnsi="Wingdings" w:hint="default"/>
+        <w:sz w:val="20"/>
+      </w:rPr>
+    </w:lvl>
+    <w:lvl w:ilvl="4" w:tentative="1">
+      <w:start w:val="1"/>
+      <w:numFmt w:val="bullet"/>
+      <w:lvlText w:val=""/>
+      <w:lvlJc w:val="left"/>
+      <w:pPr>
+        <w:tabs>
+          <w:tab w:val="num" w:pos="3600"/>
+        </w:tabs>
+        <w:ind w:left="3600" w:hanging="360"/>
+      </w:pPr>
+      <w:rPr>
+        <w:rFonts w:ascii="Wingdings" w:hAnsi="Wingdings" w:hint="default"/>
+        <w:sz w:val="20"/>
+      </w:rPr>
+    </w:lvl>
+    <w:lvl w:ilvl="5" w:tentative="1">
+      <w:start w:val="1"/>
+      <w:numFmt w:val="bullet"/>
+      <w:lvlText w:val=""/>
+      <w:lvlJc w:val="left"/>
+      <w:pPr>
+        <w:tabs>
+          <w:tab w:val="num" w:pos="4320"/>
+        </w:tabs>
+        <w:ind w:left="4320" w:hanging="360"/>
+      </w:pPr>
+      <w:rPr>
+        <w:rFonts w:ascii="Wingdings" w:hAnsi="Wingdings" w:hint="default"/>
+        <w:sz w:val="20"/>
+      </w:rPr>
+    </w:lvl>
+    <w:lvl w:ilvl="6" w:tentative="1">
+      <w:start w:val="1"/>
+      <w:numFmt w:val="bullet"/>
+      <w:lvlText w:val=""/>
+      <w:lvlJc w:val="left"/>
+      <w:pPr>
+        <w:tabs>
+          <w:tab w:val="num" w:pos="5040"/>
+        </w:tabs>
+        <w:ind w:left="5040" w:hanging="360"/>
+      </w:pPr>
+      <w:rPr>
+        <w:rFonts w:ascii="Wingdings" w:hAnsi="Wingdings" w:hint="default"/>
+        <w:sz w:val="20"/>
+      </w:rPr>
+    </w:lvl>
+    <w:lvl w:ilvl="7" w:tentative="1">
+      <w:start w:val="1"/>
+      <w:numFmt w:val="bullet"/>
+      <w:lvlText w:val=""/>
+      <w:lvlJc w:val="left"/>
+      <w:pPr>
+        <w:tabs>
+          <w:tab w:val="num" w:pos="5760"/>
+        </w:tabs>
+        <w:ind w:left="5760" w:hanging="360"/>
+      </w:pPr>
+      <w:rPr>
+        <w:rFonts w:ascii="Wingdings" w:hAnsi="Wingdings" w:hint="default"/>
+        <w:sz w:val="20"/>
+      </w:rPr>
+    </w:lvl>
+    <w:lvl w:ilvl="8" w:tentative="1">
+      <w:start w:val="1"/>
+      <w:numFmt w:val="bullet"/>
+      <w:lvlText w:val=""/>
+      <w:lvlJc w:val="left"/>
+      <w:pPr>
+        <w:tabs>
+          <w:tab w:val="num" w:pos="6480"/>
+        </w:tabs>
+        <w:ind w:left="6480" w:hanging="360"/>
+      </w:pPr>
+      <w:rPr>
+        <w:rFonts w:ascii="Wingdings" w:hAnsi="Wingdings" w:hint="default"/>
+        <w:sz w:val="20"/>
+      </w:rPr>
+    </w:lvl>
+  </w:abstractNum>
+  <w:abstractNum w:abstractNumId="1" w15:restartNumberingAfterBreak="0">
+    <w:nsid w:val="13F00DEE"/>
+    <w:multiLevelType w:val="multilevel"/>
+    <w:tmpl w:val="4F62C1F6"/>
+    <w:lvl w:ilvl="0">
+      <w:start w:val="1"/>
+      <w:numFmt w:val="bullet"/>
+      <w:lvlText w:val=""/>
+      <w:lvlJc w:val="left"/>
+      <w:pPr>
+        <w:tabs>
+          <w:tab w:val="num" w:pos="720"/>
+        </w:tabs>
+        <w:ind w:left="720" w:hanging="360"/>
+      </w:pPr>
+      <w:rPr>
+        <w:rFonts w:ascii="Symbol" w:hAnsi="Symbol" w:hint="default"/>
+        <w:sz w:val="20"/>
+      </w:rPr>
+    </w:lvl>
+    <w:lvl w:ilvl="1" w:tentative="1">
+      <w:start w:val="1"/>
+      <w:numFmt w:val="bullet"/>
+      <w:lvlText w:val="o"/>
+      <w:lvlJc w:val="left"/>
+      <w:pPr>
+        <w:tabs>
+          <w:tab w:val="num" w:pos="1440"/>
+        </w:tabs>
+        <w:ind w:left="1440" w:hanging="360"/>
+      </w:pPr>
+      <w:rPr>
+        <w:rFonts w:ascii="Courier New" w:hAnsi="Courier New" w:hint="default"/>
+        <w:sz w:val="20"/>
+      </w:rPr>
+    </w:lvl>
+    <w:lvl w:ilvl="2" w:tentative="1">
+      <w:start w:val="1"/>
+      <w:numFmt w:val="bullet"/>
+      <w:lvlText w:val=""/>
+      <w:lvlJc w:val="left"/>
+      <w:pPr>
+        <w:tabs>
+          <w:tab w:val="num" w:pos="2160"/>
+        </w:tabs>
+        <w:ind w:left="2160" w:hanging="360"/>
+      </w:pPr>
+      <w:rPr>
+        <w:rFonts w:ascii="Wingdings" w:hAnsi="Wingdings" w:hint="default"/>
+        <w:sz w:val="20"/>
+      </w:rPr>
+    </w:lvl>
+    <w:lvl w:ilvl="3" w:tentative="1">
+      <w:start w:val="1"/>
+      <w:numFmt w:val="bullet"/>
+      <w:lvlText w:val=""/>
+      <w:lvlJc w:val="left"/>
+      <w:pPr>
+        <w:tabs>
+          <w:tab w:val="num" w:pos="2880"/>
+        </w:tabs>
+        <w:ind w:left="2880" w:hanging="360"/>
+      </w:pPr>
+      <w:rPr>
+        <w:rFonts w:ascii="Wingdings" w:hAnsi="Wingdings" w:hint="default"/>
+        <w:sz w:val="20"/>
+      </w:rPr>
+    </w:lvl>
+    <w:lvl w:ilvl="4" w:tentative="1">
+      <w:start w:val="1"/>
+      <w:numFmt w:val="bullet"/>
+      <w:lvlText w:val=""/>
+      <w:lvlJc w:val="left"/>
+      <w:pPr>
+        <w:tabs>
+          <w:tab w:val="num" w:pos="3600"/>
+        </w:tabs>
+        <w:ind w:left="3600" w:hanging="360"/>
+      </w:pPr>
+      <w:rPr>
+        <w:rFonts w:ascii="Wingdings" w:hAnsi="Wingdings" w:hint="default"/>
+        <w:sz w:val="20"/>
+      </w:rPr>
+    </w:lvl>
+    <w:lvl w:ilvl="5" w:tentative="1">
+      <w:start w:val="1"/>
+      <w:numFmt w:val="bullet"/>
+      <w:lvlText w:val=""/>
+      <w:lvlJc w:val="left"/>
+      <w:pPr>
+        <w:tabs>
+          <w:tab w:val="num" w:pos="4320"/>
+        </w:tabs>
+        <w:ind w:left="4320" w:hanging="360"/>
+      </w:pPr>
+      <w:rPr>
+        <w:rFonts w:ascii="Wingdings" w:hAnsi="Wingdings" w:hint="default"/>
+        <w:sz w:val="20"/>
+      </w:rPr>
+    </w:lvl>
+    <w:lvl w:ilvl="6" w:tentative="1">
+      <w:start w:val="1"/>
+      <w:numFmt w:val="bullet"/>
+      <w:lvlText w:val=""/>
+      <w:lvlJc w:val="left"/>
+      <w:pPr>
+        <w:tabs>
+          <w:tab w:val="num" w:pos="5040"/>
+        </w:tabs>
+        <w:ind w:left="5040" w:hanging="360"/>
+      </w:pPr>
+      <w:rPr>
+        <w:rFonts w:ascii="Wingdings" w:hAnsi="Wingdings" w:hint="default"/>
+        <w:sz w:val="20"/>
+      </w:rPr>
+    </w:lvl>
+    <w:lvl w:ilvl="7" w:tentative="1">
+      <w:start w:val="1"/>
+      <w:numFmt w:val="bullet"/>
+      <w:lvlText w:val=""/>
+      <w:lvlJc w:val="left"/>
+      <w:pPr>
+        <w:tabs>
+          <w:tab w:val="num" w:pos="5760"/>
+        </w:tabs>
+        <w:ind w:left="5760" w:hanging="360"/>
+      </w:pPr>
+      <w:rPr>
+        <w:rFonts w:ascii="Wingdings" w:hAnsi="Wingdings" w:hint="default"/>
+        <w:sz w:val="20"/>
+      </w:rPr>
+    </w:lvl>
+    <w:lvl w:ilvl="8" w:tentative="1">
+      <w:start w:val="1"/>
+      <w:numFmt w:val="bullet"/>
+      <w:lvlText w:val=""/>
+      <w:lvlJc w:val="left"/>
+      <w:pPr>
+        <w:tabs>
+          <w:tab w:val="num" w:pos="6480"/>
+        </w:tabs>
+        <w:ind w:left="6480" w:hanging="360"/>
+      </w:pPr>
+      <w:rPr>
+        <w:rFonts w:ascii="Wingdings" w:hAnsi="Wingdings" w:hint="default"/>
+        <w:sz w:val="20"/>
+      </w:rPr>
+    </w:lvl>
+  </w:abstractNum>
+  <w:abstractNum w:abstractNumId="2" w15:restartNumberingAfterBreak="0">
     <w:nsid w:val="1606081D"/>
     <w:multiLevelType w:val="hybridMultilevel"/>
     <w:tmpl w:val="36A0FBE8"/>
@@ -5283,7 +6134,1908 @@
       </w:rPr>
     </w:lvl>
   </w:abstractNum>
-  <w:abstractNum w:abstractNumId="1" w15:restartNumberingAfterBreak="0">
+  <w:abstractNum w:abstractNumId="3" w15:restartNumberingAfterBreak="0">
+    <w:nsid w:val="27DE394A"/>
+    <w:multiLevelType w:val="multilevel"/>
+    <w:tmpl w:val="2A58FB68"/>
+    <w:lvl w:ilvl="0">
+      <w:start w:val="1"/>
+      <w:numFmt w:val="bullet"/>
+      <w:lvlText w:val=""/>
+      <w:lvlJc w:val="left"/>
+      <w:pPr>
+        <w:tabs>
+          <w:tab w:val="num" w:pos="720"/>
+        </w:tabs>
+        <w:ind w:left="720" w:hanging="360"/>
+      </w:pPr>
+      <w:rPr>
+        <w:rFonts w:ascii="Symbol" w:hAnsi="Symbol" w:hint="default"/>
+        <w:sz w:val="20"/>
+      </w:rPr>
+    </w:lvl>
+    <w:lvl w:ilvl="1" w:tentative="1">
+      <w:start w:val="1"/>
+      <w:numFmt w:val="bullet"/>
+      <w:lvlText w:val="o"/>
+      <w:lvlJc w:val="left"/>
+      <w:pPr>
+        <w:tabs>
+          <w:tab w:val="num" w:pos="1440"/>
+        </w:tabs>
+        <w:ind w:left="1440" w:hanging="360"/>
+      </w:pPr>
+      <w:rPr>
+        <w:rFonts w:ascii="Courier New" w:hAnsi="Courier New" w:hint="default"/>
+        <w:sz w:val="20"/>
+      </w:rPr>
+    </w:lvl>
+    <w:lvl w:ilvl="2" w:tentative="1">
+      <w:start w:val="1"/>
+      <w:numFmt w:val="bullet"/>
+      <w:lvlText w:val=""/>
+      <w:lvlJc w:val="left"/>
+      <w:pPr>
+        <w:tabs>
+          <w:tab w:val="num" w:pos="2160"/>
+        </w:tabs>
+        <w:ind w:left="2160" w:hanging="360"/>
+      </w:pPr>
+      <w:rPr>
+        <w:rFonts w:ascii="Wingdings" w:hAnsi="Wingdings" w:hint="default"/>
+        <w:sz w:val="20"/>
+      </w:rPr>
+    </w:lvl>
+    <w:lvl w:ilvl="3" w:tentative="1">
+      <w:start w:val="1"/>
+      <w:numFmt w:val="bullet"/>
+      <w:lvlText w:val=""/>
+      <w:lvlJc w:val="left"/>
+      <w:pPr>
+        <w:tabs>
+          <w:tab w:val="num" w:pos="2880"/>
+        </w:tabs>
+        <w:ind w:left="2880" w:hanging="360"/>
+      </w:pPr>
+      <w:rPr>
+        <w:rFonts w:ascii="Wingdings" w:hAnsi="Wingdings" w:hint="default"/>
+        <w:sz w:val="20"/>
+      </w:rPr>
+    </w:lvl>
+    <w:lvl w:ilvl="4" w:tentative="1">
+      <w:start w:val="1"/>
+      <w:numFmt w:val="bullet"/>
+      <w:lvlText w:val=""/>
+      <w:lvlJc w:val="left"/>
+      <w:pPr>
+        <w:tabs>
+          <w:tab w:val="num" w:pos="3600"/>
+        </w:tabs>
+        <w:ind w:left="3600" w:hanging="360"/>
+      </w:pPr>
+      <w:rPr>
+        <w:rFonts w:ascii="Wingdings" w:hAnsi="Wingdings" w:hint="default"/>
+        <w:sz w:val="20"/>
+      </w:rPr>
+    </w:lvl>
+    <w:lvl w:ilvl="5" w:tentative="1">
+      <w:start w:val="1"/>
+      <w:numFmt w:val="bullet"/>
+      <w:lvlText w:val=""/>
+      <w:lvlJc w:val="left"/>
+      <w:pPr>
+        <w:tabs>
+          <w:tab w:val="num" w:pos="4320"/>
+        </w:tabs>
+        <w:ind w:left="4320" w:hanging="360"/>
+      </w:pPr>
+      <w:rPr>
+        <w:rFonts w:ascii="Wingdings" w:hAnsi="Wingdings" w:hint="default"/>
+        <w:sz w:val="20"/>
+      </w:rPr>
+    </w:lvl>
+    <w:lvl w:ilvl="6" w:tentative="1">
+      <w:start w:val="1"/>
+      <w:numFmt w:val="bullet"/>
+      <w:lvlText w:val=""/>
+      <w:lvlJc w:val="left"/>
+      <w:pPr>
+        <w:tabs>
+          <w:tab w:val="num" w:pos="5040"/>
+        </w:tabs>
+        <w:ind w:left="5040" w:hanging="360"/>
+      </w:pPr>
+      <w:rPr>
+        <w:rFonts w:ascii="Wingdings" w:hAnsi="Wingdings" w:hint="default"/>
+        <w:sz w:val="20"/>
+      </w:rPr>
+    </w:lvl>
+    <w:lvl w:ilvl="7" w:tentative="1">
+      <w:start w:val="1"/>
+      <w:numFmt w:val="bullet"/>
+      <w:lvlText w:val=""/>
+      <w:lvlJc w:val="left"/>
+      <w:pPr>
+        <w:tabs>
+          <w:tab w:val="num" w:pos="5760"/>
+        </w:tabs>
+        <w:ind w:left="5760" w:hanging="360"/>
+      </w:pPr>
+      <w:rPr>
+        <w:rFonts w:ascii="Wingdings" w:hAnsi="Wingdings" w:hint="default"/>
+        <w:sz w:val="20"/>
+      </w:rPr>
+    </w:lvl>
+    <w:lvl w:ilvl="8" w:tentative="1">
+      <w:start w:val="1"/>
+      <w:numFmt w:val="bullet"/>
+      <w:lvlText w:val=""/>
+      <w:lvlJc w:val="left"/>
+      <w:pPr>
+        <w:tabs>
+          <w:tab w:val="num" w:pos="6480"/>
+        </w:tabs>
+        <w:ind w:left="6480" w:hanging="360"/>
+      </w:pPr>
+      <w:rPr>
+        <w:rFonts w:ascii="Wingdings" w:hAnsi="Wingdings" w:hint="default"/>
+        <w:sz w:val="20"/>
+      </w:rPr>
+    </w:lvl>
+  </w:abstractNum>
+  <w:abstractNum w:abstractNumId="4" w15:restartNumberingAfterBreak="0">
+    <w:nsid w:val="29F96934"/>
+    <w:multiLevelType w:val="multilevel"/>
+    <w:tmpl w:val="5E6AA73A"/>
+    <w:lvl w:ilvl="0">
+      <w:start w:val="1"/>
+      <w:numFmt w:val="bullet"/>
+      <w:lvlText w:val=""/>
+      <w:lvlJc w:val="left"/>
+      <w:pPr>
+        <w:tabs>
+          <w:tab w:val="num" w:pos="720"/>
+        </w:tabs>
+        <w:ind w:left="720" w:hanging="360"/>
+      </w:pPr>
+      <w:rPr>
+        <w:rFonts w:ascii="Symbol" w:hAnsi="Symbol" w:hint="default"/>
+        <w:sz w:val="20"/>
+      </w:rPr>
+    </w:lvl>
+    <w:lvl w:ilvl="1" w:tentative="1">
+      <w:start w:val="1"/>
+      <w:numFmt w:val="bullet"/>
+      <w:lvlText w:val="o"/>
+      <w:lvlJc w:val="left"/>
+      <w:pPr>
+        <w:tabs>
+          <w:tab w:val="num" w:pos="1440"/>
+        </w:tabs>
+        <w:ind w:left="1440" w:hanging="360"/>
+      </w:pPr>
+      <w:rPr>
+        <w:rFonts w:ascii="Courier New" w:hAnsi="Courier New" w:hint="default"/>
+        <w:sz w:val="20"/>
+      </w:rPr>
+    </w:lvl>
+    <w:lvl w:ilvl="2" w:tentative="1">
+      <w:start w:val="1"/>
+      <w:numFmt w:val="bullet"/>
+      <w:lvlText w:val=""/>
+      <w:lvlJc w:val="left"/>
+      <w:pPr>
+        <w:tabs>
+          <w:tab w:val="num" w:pos="2160"/>
+        </w:tabs>
+        <w:ind w:left="2160" w:hanging="360"/>
+      </w:pPr>
+      <w:rPr>
+        <w:rFonts w:ascii="Wingdings" w:hAnsi="Wingdings" w:hint="default"/>
+        <w:sz w:val="20"/>
+      </w:rPr>
+    </w:lvl>
+    <w:lvl w:ilvl="3" w:tentative="1">
+      <w:start w:val="1"/>
+      <w:numFmt w:val="bullet"/>
+      <w:lvlText w:val=""/>
+      <w:lvlJc w:val="left"/>
+      <w:pPr>
+        <w:tabs>
+          <w:tab w:val="num" w:pos="2880"/>
+        </w:tabs>
+        <w:ind w:left="2880" w:hanging="360"/>
+      </w:pPr>
+      <w:rPr>
+        <w:rFonts w:ascii="Wingdings" w:hAnsi="Wingdings" w:hint="default"/>
+        <w:sz w:val="20"/>
+      </w:rPr>
+    </w:lvl>
+    <w:lvl w:ilvl="4" w:tentative="1">
+      <w:start w:val="1"/>
+      <w:numFmt w:val="bullet"/>
+      <w:lvlText w:val=""/>
+      <w:lvlJc w:val="left"/>
+      <w:pPr>
+        <w:tabs>
+          <w:tab w:val="num" w:pos="3600"/>
+        </w:tabs>
+        <w:ind w:left="3600" w:hanging="360"/>
+      </w:pPr>
+      <w:rPr>
+        <w:rFonts w:ascii="Wingdings" w:hAnsi="Wingdings" w:hint="default"/>
+        <w:sz w:val="20"/>
+      </w:rPr>
+    </w:lvl>
+    <w:lvl w:ilvl="5" w:tentative="1">
+      <w:start w:val="1"/>
+      <w:numFmt w:val="bullet"/>
+      <w:lvlText w:val=""/>
+      <w:lvlJc w:val="left"/>
+      <w:pPr>
+        <w:tabs>
+          <w:tab w:val="num" w:pos="4320"/>
+        </w:tabs>
+        <w:ind w:left="4320" w:hanging="360"/>
+      </w:pPr>
+      <w:rPr>
+        <w:rFonts w:ascii="Wingdings" w:hAnsi="Wingdings" w:hint="default"/>
+        <w:sz w:val="20"/>
+      </w:rPr>
+    </w:lvl>
+    <w:lvl w:ilvl="6" w:tentative="1">
+      <w:start w:val="1"/>
+      <w:numFmt w:val="bullet"/>
+      <w:lvlText w:val=""/>
+      <w:lvlJc w:val="left"/>
+      <w:pPr>
+        <w:tabs>
+          <w:tab w:val="num" w:pos="5040"/>
+        </w:tabs>
+        <w:ind w:left="5040" w:hanging="360"/>
+      </w:pPr>
+      <w:rPr>
+        <w:rFonts w:ascii="Wingdings" w:hAnsi="Wingdings" w:hint="default"/>
+        <w:sz w:val="20"/>
+      </w:rPr>
+    </w:lvl>
+    <w:lvl w:ilvl="7" w:tentative="1">
+      <w:start w:val="1"/>
+      <w:numFmt w:val="bullet"/>
+      <w:lvlText w:val=""/>
+      <w:lvlJc w:val="left"/>
+      <w:pPr>
+        <w:tabs>
+          <w:tab w:val="num" w:pos="5760"/>
+        </w:tabs>
+        <w:ind w:left="5760" w:hanging="360"/>
+      </w:pPr>
+      <w:rPr>
+        <w:rFonts w:ascii="Wingdings" w:hAnsi="Wingdings" w:hint="default"/>
+        <w:sz w:val="20"/>
+      </w:rPr>
+    </w:lvl>
+    <w:lvl w:ilvl="8" w:tentative="1">
+      <w:start w:val="1"/>
+      <w:numFmt w:val="bullet"/>
+      <w:lvlText w:val=""/>
+      <w:lvlJc w:val="left"/>
+      <w:pPr>
+        <w:tabs>
+          <w:tab w:val="num" w:pos="6480"/>
+        </w:tabs>
+        <w:ind w:left="6480" w:hanging="360"/>
+      </w:pPr>
+      <w:rPr>
+        <w:rFonts w:ascii="Wingdings" w:hAnsi="Wingdings" w:hint="default"/>
+        <w:sz w:val="20"/>
+      </w:rPr>
+    </w:lvl>
+  </w:abstractNum>
+  <w:abstractNum w:abstractNumId="5" w15:restartNumberingAfterBreak="0">
+    <w:nsid w:val="35374CDE"/>
+    <w:multiLevelType w:val="multilevel"/>
+    <w:tmpl w:val="36C81652"/>
+    <w:lvl w:ilvl="0">
+      <w:start w:val="1"/>
+      <w:numFmt w:val="bullet"/>
+      <w:lvlText w:val=""/>
+      <w:lvlJc w:val="left"/>
+      <w:pPr>
+        <w:tabs>
+          <w:tab w:val="num" w:pos="720"/>
+        </w:tabs>
+        <w:ind w:left="720" w:hanging="360"/>
+      </w:pPr>
+      <w:rPr>
+        <w:rFonts w:ascii="Symbol" w:hAnsi="Symbol" w:hint="default"/>
+        <w:sz w:val="20"/>
+      </w:rPr>
+    </w:lvl>
+    <w:lvl w:ilvl="1" w:tentative="1">
+      <w:start w:val="1"/>
+      <w:numFmt w:val="bullet"/>
+      <w:lvlText w:val="o"/>
+      <w:lvlJc w:val="left"/>
+      <w:pPr>
+        <w:tabs>
+          <w:tab w:val="num" w:pos="1440"/>
+        </w:tabs>
+        <w:ind w:left="1440" w:hanging="360"/>
+      </w:pPr>
+      <w:rPr>
+        <w:rFonts w:ascii="Courier New" w:hAnsi="Courier New" w:hint="default"/>
+        <w:sz w:val="20"/>
+      </w:rPr>
+    </w:lvl>
+    <w:lvl w:ilvl="2" w:tentative="1">
+      <w:start w:val="1"/>
+      <w:numFmt w:val="bullet"/>
+      <w:lvlText w:val=""/>
+      <w:lvlJc w:val="left"/>
+      <w:pPr>
+        <w:tabs>
+          <w:tab w:val="num" w:pos="2160"/>
+        </w:tabs>
+        <w:ind w:left="2160" w:hanging="360"/>
+      </w:pPr>
+      <w:rPr>
+        <w:rFonts w:ascii="Wingdings" w:hAnsi="Wingdings" w:hint="default"/>
+        <w:sz w:val="20"/>
+      </w:rPr>
+    </w:lvl>
+    <w:lvl w:ilvl="3" w:tentative="1">
+      <w:start w:val="1"/>
+      <w:numFmt w:val="bullet"/>
+      <w:lvlText w:val=""/>
+      <w:lvlJc w:val="left"/>
+      <w:pPr>
+        <w:tabs>
+          <w:tab w:val="num" w:pos="2880"/>
+        </w:tabs>
+        <w:ind w:left="2880" w:hanging="360"/>
+      </w:pPr>
+      <w:rPr>
+        <w:rFonts w:ascii="Wingdings" w:hAnsi="Wingdings" w:hint="default"/>
+        <w:sz w:val="20"/>
+      </w:rPr>
+    </w:lvl>
+    <w:lvl w:ilvl="4" w:tentative="1">
+      <w:start w:val="1"/>
+      <w:numFmt w:val="bullet"/>
+      <w:lvlText w:val=""/>
+      <w:lvlJc w:val="left"/>
+      <w:pPr>
+        <w:tabs>
+          <w:tab w:val="num" w:pos="3600"/>
+        </w:tabs>
+        <w:ind w:left="3600" w:hanging="360"/>
+      </w:pPr>
+      <w:rPr>
+        <w:rFonts w:ascii="Wingdings" w:hAnsi="Wingdings" w:hint="default"/>
+        <w:sz w:val="20"/>
+      </w:rPr>
+    </w:lvl>
+    <w:lvl w:ilvl="5" w:tentative="1">
+      <w:start w:val="1"/>
+      <w:numFmt w:val="bullet"/>
+      <w:lvlText w:val=""/>
+      <w:lvlJc w:val="left"/>
+      <w:pPr>
+        <w:tabs>
+          <w:tab w:val="num" w:pos="4320"/>
+        </w:tabs>
+        <w:ind w:left="4320" w:hanging="360"/>
+      </w:pPr>
+      <w:rPr>
+        <w:rFonts w:ascii="Wingdings" w:hAnsi="Wingdings" w:hint="default"/>
+        <w:sz w:val="20"/>
+      </w:rPr>
+    </w:lvl>
+    <w:lvl w:ilvl="6" w:tentative="1">
+      <w:start w:val="1"/>
+      <w:numFmt w:val="bullet"/>
+      <w:lvlText w:val=""/>
+      <w:lvlJc w:val="left"/>
+      <w:pPr>
+        <w:tabs>
+          <w:tab w:val="num" w:pos="5040"/>
+        </w:tabs>
+        <w:ind w:left="5040" w:hanging="360"/>
+      </w:pPr>
+      <w:rPr>
+        <w:rFonts w:ascii="Wingdings" w:hAnsi="Wingdings" w:hint="default"/>
+        <w:sz w:val="20"/>
+      </w:rPr>
+    </w:lvl>
+    <w:lvl w:ilvl="7" w:tentative="1">
+      <w:start w:val="1"/>
+      <w:numFmt w:val="bullet"/>
+      <w:lvlText w:val=""/>
+      <w:lvlJc w:val="left"/>
+      <w:pPr>
+        <w:tabs>
+          <w:tab w:val="num" w:pos="5760"/>
+        </w:tabs>
+        <w:ind w:left="5760" w:hanging="360"/>
+      </w:pPr>
+      <w:rPr>
+        <w:rFonts w:ascii="Wingdings" w:hAnsi="Wingdings" w:hint="default"/>
+        <w:sz w:val="20"/>
+      </w:rPr>
+    </w:lvl>
+    <w:lvl w:ilvl="8" w:tentative="1">
+      <w:start w:val="1"/>
+      <w:numFmt w:val="bullet"/>
+      <w:lvlText w:val=""/>
+      <w:lvlJc w:val="left"/>
+      <w:pPr>
+        <w:tabs>
+          <w:tab w:val="num" w:pos="6480"/>
+        </w:tabs>
+        <w:ind w:left="6480" w:hanging="360"/>
+      </w:pPr>
+      <w:rPr>
+        <w:rFonts w:ascii="Wingdings" w:hAnsi="Wingdings" w:hint="default"/>
+        <w:sz w:val="20"/>
+      </w:rPr>
+    </w:lvl>
+  </w:abstractNum>
+  <w:abstractNum w:abstractNumId="6" w15:restartNumberingAfterBreak="0">
+    <w:nsid w:val="368D6AAD"/>
+    <w:multiLevelType w:val="hybridMultilevel"/>
+    <w:tmpl w:val="6262D734"/>
+    <w:lvl w:ilvl="0" w:tplc="04050001">
+      <w:start w:val="1"/>
+      <w:numFmt w:val="bullet"/>
+      <w:lvlText w:val=""/>
+      <w:lvlJc w:val="left"/>
+      <w:pPr>
+        <w:ind w:left="720" w:hanging="360"/>
+      </w:pPr>
+      <w:rPr>
+        <w:rFonts w:ascii="Symbol" w:hAnsi="Symbol" w:hint="default"/>
+      </w:rPr>
+    </w:lvl>
+    <w:lvl w:ilvl="1" w:tplc="04050003" w:tentative="1">
+      <w:start w:val="1"/>
+      <w:numFmt w:val="bullet"/>
+      <w:lvlText w:val="o"/>
+      <w:lvlJc w:val="left"/>
+      <w:pPr>
+        <w:ind w:left="1440" w:hanging="360"/>
+      </w:pPr>
+      <w:rPr>
+        <w:rFonts w:ascii="Courier New" w:hAnsi="Courier New" w:cs="Courier New" w:hint="default"/>
+      </w:rPr>
+    </w:lvl>
+    <w:lvl w:ilvl="2" w:tplc="04050005" w:tentative="1">
+      <w:start w:val="1"/>
+      <w:numFmt w:val="bullet"/>
+      <w:lvlText w:val=""/>
+      <w:lvlJc w:val="left"/>
+      <w:pPr>
+        <w:ind w:left="2160" w:hanging="360"/>
+      </w:pPr>
+      <w:rPr>
+        <w:rFonts w:ascii="Wingdings" w:hAnsi="Wingdings" w:hint="default"/>
+      </w:rPr>
+    </w:lvl>
+    <w:lvl w:ilvl="3" w:tplc="04050001" w:tentative="1">
+      <w:start w:val="1"/>
+      <w:numFmt w:val="bullet"/>
+      <w:lvlText w:val=""/>
+      <w:lvlJc w:val="left"/>
+      <w:pPr>
+        <w:ind w:left="2880" w:hanging="360"/>
+      </w:pPr>
+      <w:rPr>
+        <w:rFonts w:ascii="Symbol" w:hAnsi="Symbol" w:hint="default"/>
+      </w:rPr>
+    </w:lvl>
+    <w:lvl w:ilvl="4" w:tplc="04050003" w:tentative="1">
+      <w:start w:val="1"/>
+      <w:numFmt w:val="bullet"/>
+      <w:lvlText w:val="o"/>
+      <w:lvlJc w:val="left"/>
+      <w:pPr>
+        <w:ind w:left="3600" w:hanging="360"/>
+      </w:pPr>
+      <w:rPr>
+        <w:rFonts w:ascii="Courier New" w:hAnsi="Courier New" w:cs="Courier New" w:hint="default"/>
+      </w:rPr>
+    </w:lvl>
+    <w:lvl w:ilvl="5" w:tplc="04050005" w:tentative="1">
+      <w:start w:val="1"/>
+      <w:numFmt w:val="bullet"/>
+      <w:lvlText w:val=""/>
+      <w:lvlJc w:val="left"/>
+      <w:pPr>
+        <w:ind w:left="4320" w:hanging="360"/>
+      </w:pPr>
+      <w:rPr>
+        <w:rFonts w:ascii="Wingdings" w:hAnsi="Wingdings" w:hint="default"/>
+      </w:rPr>
+    </w:lvl>
+    <w:lvl w:ilvl="6" w:tplc="04050001" w:tentative="1">
+      <w:start w:val="1"/>
+      <w:numFmt w:val="bullet"/>
+      <w:lvlText w:val=""/>
+      <w:lvlJc w:val="left"/>
+      <w:pPr>
+        <w:ind w:left="5040" w:hanging="360"/>
+      </w:pPr>
+      <w:rPr>
+        <w:rFonts w:ascii="Symbol" w:hAnsi="Symbol" w:hint="default"/>
+      </w:rPr>
+    </w:lvl>
+    <w:lvl w:ilvl="7" w:tplc="04050003" w:tentative="1">
+      <w:start w:val="1"/>
+      <w:numFmt w:val="bullet"/>
+      <w:lvlText w:val="o"/>
+      <w:lvlJc w:val="left"/>
+      <w:pPr>
+        <w:ind w:left="5760" w:hanging="360"/>
+      </w:pPr>
+      <w:rPr>
+        <w:rFonts w:ascii="Courier New" w:hAnsi="Courier New" w:cs="Courier New" w:hint="default"/>
+      </w:rPr>
+    </w:lvl>
+    <w:lvl w:ilvl="8" w:tplc="04050005" w:tentative="1">
+      <w:start w:val="1"/>
+      <w:numFmt w:val="bullet"/>
+      <w:lvlText w:val=""/>
+      <w:lvlJc w:val="left"/>
+      <w:pPr>
+        <w:ind w:left="6480" w:hanging="360"/>
+      </w:pPr>
+      <w:rPr>
+        <w:rFonts w:ascii="Wingdings" w:hAnsi="Wingdings" w:hint="default"/>
+      </w:rPr>
+    </w:lvl>
+  </w:abstractNum>
+  <w:abstractNum w:abstractNumId="7" w15:restartNumberingAfterBreak="0">
+    <w:nsid w:val="3769771C"/>
+    <w:multiLevelType w:val="multilevel"/>
+    <w:tmpl w:val="85DA7A7C"/>
+    <w:lvl w:ilvl="0">
+      <w:start w:val="1"/>
+      <w:numFmt w:val="bullet"/>
+      <w:lvlText w:val=""/>
+      <w:lvlJc w:val="left"/>
+      <w:pPr>
+        <w:tabs>
+          <w:tab w:val="num" w:pos="720"/>
+        </w:tabs>
+        <w:ind w:left="720" w:hanging="360"/>
+      </w:pPr>
+      <w:rPr>
+        <w:rFonts w:ascii="Symbol" w:hAnsi="Symbol" w:hint="default"/>
+        <w:sz w:val="20"/>
+      </w:rPr>
+    </w:lvl>
+    <w:lvl w:ilvl="1" w:tentative="1">
+      <w:start w:val="1"/>
+      <w:numFmt w:val="bullet"/>
+      <w:lvlText w:val="o"/>
+      <w:lvlJc w:val="left"/>
+      <w:pPr>
+        <w:tabs>
+          <w:tab w:val="num" w:pos="1440"/>
+        </w:tabs>
+        <w:ind w:left="1440" w:hanging="360"/>
+      </w:pPr>
+      <w:rPr>
+        <w:rFonts w:ascii="Courier New" w:hAnsi="Courier New" w:hint="default"/>
+        <w:sz w:val="20"/>
+      </w:rPr>
+    </w:lvl>
+    <w:lvl w:ilvl="2" w:tentative="1">
+      <w:start w:val="1"/>
+      <w:numFmt w:val="bullet"/>
+      <w:lvlText w:val=""/>
+      <w:lvlJc w:val="left"/>
+      <w:pPr>
+        <w:tabs>
+          <w:tab w:val="num" w:pos="2160"/>
+        </w:tabs>
+        <w:ind w:left="2160" w:hanging="360"/>
+      </w:pPr>
+      <w:rPr>
+        <w:rFonts w:ascii="Wingdings" w:hAnsi="Wingdings" w:hint="default"/>
+        <w:sz w:val="20"/>
+      </w:rPr>
+    </w:lvl>
+    <w:lvl w:ilvl="3" w:tentative="1">
+      <w:start w:val="1"/>
+      <w:numFmt w:val="bullet"/>
+      <w:lvlText w:val=""/>
+      <w:lvlJc w:val="left"/>
+      <w:pPr>
+        <w:tabs>
+          <w:tab w:val="num" w:pos="2880"/>
+        </w:tabs>
+        <w:ind w:left="2880" w:hanging="360"/>
+      </w:pPr>
+      <w:rPr>
+        <w:rFonts w:ascii="Wingdings" w:hAnsi="Wingdings" w:hint="default"/>
+        <w:sz w:val="20"/>
+      </w:rPr>
+    </w:lvl>
+    <w:lvl w:ilvl="4" w:tentative="1">
+      <w:start w:val="1"/>
+      <w:numFmt w:val="bullet"/>
+      <w:lvlText w:val=""/>
+      <w:lvlJc w:val="left"/>
+      <w:pPr>
+        <w:tabs>
+          <w:tab w:val="num" w:pos="3600"/>
+        </w:tabs>
+        <w:ind w:left="3600" w:hanging="360"/>
+      </w:pPr>
+      <w:rPr>
+        <w:rFonts w:ascii="Wingdings" w:hAnsi="Wingdings" w:hint="default"/>
+        <w:sz w:val="20"/>
+      </w:rPr>
+    </w:lvl>
+    <w:lvl w:ilvl="5" w:tentative="1">
+      <w:start w:val="1"/>
+      <w:numFmt w:val="bullet"/>
+      <w:lvlText w:val=""/>
+      <w:lvlJc w:val="left"/>
+      <w:pPr>
+        <w:tabs>
+          <w:tab w:val="num" w:pos="4320"/>
+        </w:tabs>
+        <w:ind w:left="4320" w:hanging="360"/>
+      </w:pPr>
+      <w:rPr>
+        <w:rFonts w:ascii="Wingdings" w:hAnsi="Wingdings" w:hint="default"/>
+        <w:sz w:val="20"/>
+      </w:rPr>
+    </w:lvl>
+    <w:lvl w:ilvl="6" w:tentative="1">
+      <w:start w:val="1"/>
+      <w:numFmt w:val="bullet"/>
+      <w:lvlText w:val=""/>
+      <w:lvlJc w:val="left"/>
+      <w:pPr>
+        <w:tabs>
+          <w:tab w:val="num" w:pos="5040"/>
+        </w:tabs>
+        <w:ind w:left="5040" w:hanging="360"/>
+      </w:pPr>
+      <w:rPr>
+        <w:rFonts w:ascii="Wingdings" w:hAnsi="Wingdings" w:hint="default"/>
+        <w:sz w:val="20"/>
+      </w:rPr>
+    </w:lvl>
+    <w:lvl w:ilvl="7" w:tentative="1">
+      <w:start w:val="1"/>
+      <w:numFmt w:val="bullet"/>
+      <w:lvlText w:val=""/>
+      <w:lvlJc w:val="left"/>
+      <w:pPr>
+        <w:tabs>
+          <w:tab w:val="num" w:pos="5760"/>
+        </w:tabs>
+        <w:ind w:left="5760" w:hanging="360"/>
+      </w:pPr>
+      <w:rPr>
+        <w:rFonts w:ascii="Wingdings" w:hAnsi="Wingdings" w:hint="default"/>
+        <w:sz w:val="20"/>
+      </w:rPr>
+    </w:lvl>
+    <w:lvl w:ilvl="8" w:tentative="1">
+      <w:start w:val="1"/>
+      <w:numFmt w:val="bullet"/>
+      <w:lvlText w:val=""/>
+      <w:lvlJc w:val="left"/>
+      <w:pPr>
+        <w:tabs>
+          <w:tab w:val="num" w:pos="6480"/>
+        </w:tabs>
+        <w:ind w:left="6480" w:hanging="360"/>
+      </w:pPr>
+      <w:rPr>
+        <w:rFonts w:ascii="Wingdings" w:hAnsi="Wingdings" w:hint="default"/>
+        <w:sz w:val="20"/>
+      </w:rPr>
+    </w:lvl>
+  </w:abstractNum>
+  <w:abstractNum w:abstractNumId="8" w15:restartNumberingAfterBreak="0">
+    <w:nsid w:val="3A1620A4"/>
+    <w:multiLevelType w:val="multilevel"/>
+    <w:tmpl w:val="DB7A5DDE"/>
+    <w:lvl w:ilvl="0">
+      <w:start w:val="1"/>
+      <w:numFmt w:val="bullet"/>
+      <w:lvlText w:val=""/>
+      <w:lvlJc w:val="left"/>
+      <w:pPr>
+        <w:tabs>
+          <w:tab w:val="num" w:pos="720"/>
+        </w:tabs>
+        <w:ind w:left="720" w:hanging="360"/>
+      </w:pPr>
+      <w:rPr>
+        <w:rFonts w:ascii="Symbol" w:hAnsi="Symbol" w:hint="default"/>
+        <w:sz w:val="20"/>
+      </w:rPr>
+    </w:lvl>
+    <w:lvl w:ilvl="1" w:tentative="1">
+      <w:start w:val="1"/>
+      <w:numFmt w:val="bullet"/>
+      <w:lvlText w:val="o"/>
+      <w:lvlJc w:val="left"/>
+      <w:pPr>
+        <w:tabs>
+          <w:tab w:val="num" w:pos="1440"/>
+        </w:tabs>
+        <w:ind w:left="1440" w:hanging="360"/>
+      </w:pPr>
+      <w:rPr>
+        <w:rFonts w:ascii="Courier New" w:hAnsi="Courier New" w:hint="default"/>
+        <w:sz w:val="20"/>
+      </w:rPr>
+    </w:lvl>
+    <w:lvl w:ilvl="2" w:tentative="1">
+      <w:start w:val="1"/>
+      <w:numFmt w:val="bullet"/>
+      <w:lvlText w:val=""/>
+      <w:lvlJc w:val="left"/>
+      <w:pPr>
+        <w:tabs>
+          <w:tab w:val="num" w:pos="2160"/>
+        </w:tabs>
+        <w:ind w:left="2160" w:hanging="360"/>
+      </w:pPr>
+      <w:rPr>
+        <w:rFonts w:ascii="Wingdings" w:hAnsi="Wingdings" w:hint="default"/>
+        <w:sz w:val="20"/>
+      </w:rPr>
+    </w:lvl>
+    <w:lvl w:ilvl="3" w:tentative="1">
+      <w:start w:val="1"/>
+      <w:numFmt w:val="bullet"/>
+      <w:lvlText w:val=""/>
+      <w:lvlJc w:val="left"/>
+      <w:pPr>
+        <w:tabs>
+          <w:tab w:val="num" w:pos="2880"/>
+        </w:tabs>
+        <w:ind w:left="2880" w:hanging="360"/>
+      </w:pPr>
+      <w:rPr>
+        <w:rFonts w:ascii="Wingdings" w:hAnsi="Wingdings" w:hint="default"/>
+        <w:sz w:val="20"/>
+      </w:rPr>
+    </w:lvl>
+    <w:lvl w:ilvl="4" w:tentative="1">
+      <w:start w:val="1"/>
+      <w:numFmt w:val="bullet"/>
+      <w:lvlText w:val=""/>
+      <w:lvlJc w:val="left"/>
+      <w:pPr>
+        <w:tabs>
+          <w:tab w:val="num" w:pos="3600"/>
+        </w:tabs>
+        <w:ind w:left="3600" w:hanging="360"/>
+      </w:pPr>
+      <w:rPr>
+        <w:rFonts w:ascii="Wingdings" w:hAnsi="Wingdings" w:hint="default"/>
+        <w:sz w:val="20"/>
+      </w:rPr>
+    </w:lvl>
+    <w:lvl w:ilvl="5" w:tentative="1">
+      <w:start w:val="1"/>
+      <w:numFmt w:val="bullet"/>
+      <w:lvlText w:val=""/>
+      <w:lvlJc w:val="left"/>
+      <w:pPr>
+        <w:tabs>
+          <w:tab w:val="num" w:pos="4320"/>
+        </w:tabs>
+        <w:ind w:left="4320" w:hanging="360"/>
+      </w:pPr>
+      <w:rPr>
+        <w:rFonts w:ascii="Wingdings" w:hAnsi="Wingdings" w:hint="default"/>
+        <w:sz w:val="20"/>
+      </w:rPr>
+    </w:lvl>
+    <w:lvl w:ilvl="6" w:tentative="1">
+      <w:start w:val="1"/>
+      <w:numFmt w:val="bullet"/>
+      <w:lvlText w:val=""/>
+      <w:lvlJc w:val="left"/>
+      <w:pPr>
+        <w:tabs>
+          <w:tab w:val="num" w:pos="5040"/>
+        </w:tabs>
+        <w:ind w:left="5040" w:hanging="360"/>
+      </w:pPr>
+      <w:rPr>
+        <w:rFonts w:ascii="Wingdings" w:hAnsi="Wingdings" w:hint="default"/>
+        <w:sz w:val="20"/>
+      </w:rPr>
+    </w:lvl>
+    <w:lvl w:ilvl="7" w:tentative="1">
+      <w:start w:val="1"/>
+      <w:numFmt w:val="bullet"/>
+      <w:lvlText w:val=""/>
+      <w:lvlJc w:val="left"/>
+      <w:pPr>
+        <w:tabs>
+          <w:tab w:val="num" w:pos="5760"/>
+        </w:tabs>
+        <w:ind w:left="5760" w:hanging="360"/>
+      </w:pPr>
+      <w:rPr>
+        <w:rFonts w:ascii="Wingdings" w:hAnsi="Wingdings" w:hint="default"/>
+        <w:sz w:val="20"/>
+      </w:rPr>
+    </w:lvl>
+    <w:lvl w:ilvl="8" w:tentative="1">
+      <w:start w:val="1"/>
+      <w:numFmt w:val="bullet"/>
+      <w:lvlText w:val=""/>
+      <w:lvlJc w:val="left"/>
+      <w:pPr>
+        <w:tabs>
+          <w:tab w:val="num" w:pos="6480"/>
+        </w:tabs>
+        <w:ind w:left="6480" w:hanging="360"/>
+      </w:pPr>
+      <w:rPr>
+        <w:rFonts w:ascii="Wingdings" w:hAnsi="Wingdings" w:hint="default"/>
+        <w:sz w:val="20"/>
+      </w:rPr>
+    </w:lvl>
+  </w:abstractNum>
+  <w:abstractNum w:abstractNumId="9" w15:restartNumberingAfterBreak="0">
+    <w:nsid w:val="499C22B3"/>
+    <w:multiLevelType w:val="multilevel"/>
+    <w:tmpl w:val="B60CA132"/>
+    <w:lvl w:ilvl="0">
+      <w:start w:val="1"/>
+      <w:numFmt w:val="bullet"/>
+      <w:lvlText w:val=""/>
+      <w:lvlJc w:val="left"/>
+      <w:pPr>
+        <w:tabs>
+          <w:tab w:val="num" w:pos="720"/>
+        </w:tabs>
+        <w:ind w:left="720" w:hanging="360"/>
+      </w:pPr>
+      <w:rPr>
+        <w:rFonts w:ascii="Symbol" w:hAnsi="Symbol" w:hint="default"/>
+        <w:sz w:val="20"/>
+      </w:rPr>
+    </w:lvl>
+    <w:lvl w:ilvl="1" w:tentative="1">
+      <w:start w:val="1"/>
+      <w:numFmt w:val="bullet"/>
+      <w:lvlText w:val="o"/>
+      <w:lvlJc w:val="left"/>
+      <w:pPr>
+        <w:tabs>
+          <w:tab w:val="num" w:pos="1440"/>
+        </w:tabs>
+        <w:ind w:left="1440" w:hanging="360"/>
+      </w:pPr>
+      <w:rPr>
+        <w:rFonts w:ascii="Courier New" w:hAnsi="Courier New" w:hint="default"/>
+        <w:sz w:val="20"/>
+      </w:rPr>
+    </w:lvl>
+    <w:lvl w:ilvl="2" w:tentative="1">
+      <w:start w:val="1"/>
+      <w:numFmt w:val="bullet"/>
+      <w:lvlText w:val=""/>
+      <w:lvlJc w:val="left"/>
+      <w:pPr>
+        <w:tabs>
+          <w:tab w:val="num" w:pos="2160"/>
+        </w:tabs>
+        <w:ind w:left="2160" w:hanging="360"/>
+      </w:pPr>
+      <w:rPr>
+        <w:rFonts w:ascii="Wingdings" w:hAnsi="Wingdings" w:hint="default"/>
+        <w:sz w:val="20"/>
+      </w:rPr>
+    </w:lvl>
+    <w:lvl w:ilvl="3" w:tentative="1">
+      <w:start w:val="1"/>
+      <w:numFmt w:val="bullet"/>
+      <w:lvlText w:val=""/>
+      <w:lvlJc w:val="left"/>
+      <w:pPr>
+        <w:tabs>
+          <w:tab w:val="num" w:pos="2880"/>
+        </w:tabs>
+        <w:ind w:left="2880" w:hanging="360"/>
+      </w:pPr>
+      <w:rPr>
+        <w:rFonts w:ascii="Wingdings" w:hAnsi="Wingdings" w:hint="default"/>
+        <w:sz w:val="20"/>
+      </w:rPr>
+    </w:lvl>
+    <w:lvl w:ilvl="4" w:tentative="1">
+      <w:start w:val="1"/>
+      <w:numFmt w:val="bullet"/>
+      <w:lvlText w:val=""/>
+      <w:lvlJc w:val="left"/>
+      <w:pPr>
+        <w:tabs>
+          <w:tab w:val="num" w:pos="3600"/>
+        </w:tabs>
+        <w:ind w:left="3600" w:hanging="360"/>
+      </w:pPr>
+      <w:rPr>
+        <w:rFonts w:ascii="Wingdings" w:hAnsi="Wingdings" w:hint="default"/>
+        <w:sz w:val="20"/>
+      </w:rPr>
+    </w:lvl>
+    <w:lvl w:ilvl="5" w:tentative="1">
+      <w:start w:val="1"/>
+      <w:numFmt w:val="bullet"/>
+      <w:lvlText w:val=""/>
+      <w:lvlJc w:val="left"/>
+      <w:pPr>
+        <w:tabs>
+          <w:tab w:val="num" w:pos="4320"/>
+        </w:tabs>
+        <w:ind w:left="4320" w:hanging="360"/>
+      </w:pPr>
+      <w:rPr>
+        <w:rFonts w:ascii="Wingdings" w:hAnsi="Wingdings" w:hint="default"/>
+        <w:sz w:val="20"/>
+      </w:rPr>
+    </w:lvl>
+    <w:lvl w:ilvl="6" w:tentative="1">
+      <w:start w:val="1"/>
+      <w:numFmt w:val="bullet"/>
+      <w:lvlText w:val=""/>
+      <w:lvlJc w:val="left"/>
+      <w:pPr>
+        <w:tabs>
+          <w:tab w:val="num" w:pos="5040"/>
+        </w:tabs>
+        <w:ind w:left="5040" w:hanging="360"/>
+      </w:pPr>
+      <w:rPr>
+        <w:rFonts w:ascii="Wingdings" w:hAnsi="Wingdings" w:hint="default"/>
+        <w:sz w:val="20"/>
+      </w:rPr>
+    </w:lvl>
+    <w:lvl w:ilvl="7" w:tentative="1">
+      <w:start w:val="1"/>
+      <w:numFmt w:val="bullet"/>
+      <w:lvlText w:val=""/>
+      <w:lvlJc w:val="left"/>
+      <w:pPr>
+        <w:tabs>
+          <w:tab w:val="num" w:pos="5760"/>
+        </w:tabs>
+        <w:ind w:left="5760" w:hanging="360"/>
+      </w:pPr>
+      <w:rPr>
+        <w:rFonts w:ascii="Wingdings" w:hAnsi="Wingdings" w:hint="default"/>
+        <w:sz w:val="20"/>
+      </w:rPr>
+    </w:lvl>
+    <w:lvl w:ilvl="8" w:tentative="1">
+      <w:start w:val="1"/>
+      <w:numFmt w:val="bullet"/>
+      <w:lvlText w:val=""/>
+      <w:lvlJc w:val="left"/>
+      <w:pPr>
+        <w:tabs>
+          <w:tab w:val="num" w:pos="6480"/>
+        </w:tabs>
+        <w:ind w:left="6480" w:hanging="360"/>
+      </w:pPr>
+      <w:rPr>
+        <w:rFonts w:ascii="Wingdings" w:hAnsi="Wingdings" w:hint="default"/>
+        <w:sz w:val="20"/>
+      </w:rPr>
+    </w:lvl>
+  </w:abstractNum>
+  <w:abstractNum w:abstractNumId="10" w15:restartNumberingAfterBreak="0">
+    <w:nsid w:val="527E7EA8"/>
+    <w:multiLevelType w:val="multilevel"/>
+    <w:tmpl w:val="984C183C"/>
+    <w:lvl w:ilvl="0">
+      <w:start w:val="1"/>
+      <w:numFmt w:val="bullet"/>
+      <w:lvlText w:val=""/>
+      <w:lvlJc w:val="left"/>
+      <w:pPr>
+        <w:tabs>
+          <w:tab w:val="num" w:pos="720"/>
+        </w:tabs>
+        <w:ind w:left="720" w:hanging="360"/>
+      </w:pPr>
+      <w:rPr>
+        <w:rFonts w:ascii="Symbol" w:hAnsi="Symbol" w:hint="default"/>
+        <w:sz w:val="20"/>
+      </w:rPr>
+    </w:lvl>
+    <w:lvl w:ilvl="1" w:tentative="1">
+      <w:start w:val="1"/>
+      <w:numFmt w:val="bullet"/>
+      <w:lvlText w:val="o"/>
+      <w:lvlJc w:val="left"/>
+      <w:pPr>
+        <w:tabs>
+          <w:tab w:val="num" w:pos="1440"/>
+        </w:tabs>
+        <w:ind w:left="1440" w:hanging="360"/>
+      </w:pPr>
+      <w:rPr>
+        <w:rFonts w:ascii="Courier New" w:hAnsi="Courier New" w:hint="default"/>
+        <w:sz w:val="20"/>
+      </w:rPr>
+    </w:lvl>
+    <w:lvl w:ilvl="2" w:tentative="1">
+      <w:start w:val="1"/>
+      <w:numFmt w:val="bullet"/>
+      <w:lvlText w:val=""/>
+      <w:lvlJc w:val="left"/>
+      <w:pPr>
+        <w:tabs>
+          <w:tab w:val="num" w:pos="2160"/>
+        </w:tabs>
+        <w:ind w:left="2160" w:hanging="360"/>
+      </w:pPr>
+      <w:rPr>
+        <w:rFonts w:ascii="Wingdings" w:hAnsi="Wingdings" w:hint="default"/>
+        <w:sz w:val="20"/>
+      </w:rPr>
+    </w:lvl>
+    <w:lvl w:ilvl="3" w:tentative="1">
+      <w:start w:val="1"/>
+      <w:numFmt w:val="bullet"/>
+      <w:lvlText w:val=""/>
+      <w:lvlJc w:val="left"/>
+      <w:pPr>
+        <w:tabs>
+          <w:tab w:val="num" w:pos="2880"/>
+        </w:tabs>
+        <w:ind w:left="2880" w:hanging="360"/>
+      </w:pPr>
+      <w:rPr>
+        <w:rFonts w:ascii="Wingdings" w:hAnsi="Wingdings" w:hint="default"/>
+        <w:sz w:val="20"/>
+      </w:rPr>
+    </w:lvl>
+    <w:lvl w:ilvl="4" w:tentative="1">
+      <w:start w:val="1"/>
+      <w:numFmt w:val="bullet"/>
+      <w:lvlText w:val=""/>
+      <w:lvlJc w:val="left"/>
+      <w:pPr>
+        <w:tabs>
+          <w:tab w:val="num" w:pos="3600"/>
+        </w:tabs>
+        <w:ind w:left="3600" w:hanging="360"/>
+      </w:pPr>
+      <w:rPr>
+        <w:rFonts w:ascii="Wingdings" w:hAnsi="Wingdings" w:hint="default"/>
+        <w:sz w:val="20"/>
+      </w:rPr>
+    </w:lvl>
+    <w:lvl w:ilvl="5" w:tentative="1">
+      <w:start w:val="1"/>
+      <w:numFmt w:val="bullet"/>
+      <w:lvlText w:val=""/>
+      <w:lvlJc w:val="left"/>
+      <w:pPr>
+        <w:tabs>
+          <w:tab w:val="num" w:pos="4320"/>
+        </w:tabs>
+        <w:ind w:left="4320" w:hanging="360"/>
+      </w:pPr>
+      <w:rPr>
+        <w:rFonts w:ascii="Wingdings" w:hAnsi="Wingdings" w:hint="default"/>
+        <w:sz w:val="20"/>
+      </w:rPr>
+    </w:lvl>
+    <w:lvl w:ilvl="6" w:tentative="1">
+      <w:start w:val="1"/>
+      <w:numFmt w:val="bullet"/>
+      <w:lvlText w:val=""/>
+      <w:lvlJc w:val="left"/>
+      <w:pPr>
+        <w:tabs>
+          <w:tab w:val="num" w:pos="5040"/>
+        </w:tabs>
+        <w:ind w:left="5040" w:hanging="360"/>
+      </w:pPr>
+      <w:rPr>
+        <w:rFonts w:ascii="Wingdings" w:hAnsi="Wingdings" w:hint="default"/>
+        <w:sz w:val="20"/>
+      </w:rPr>
+    </w:lvl>
+    <w:lvl w:ilvl="7" w:tentative="1">
+      <w:start w:val="1"/>
+      <w:numFmt w:val="bullet"/>
+      <w:lvlText w:val=""/>
+      <w:lvlJc w:val="left"/>
+      <w:pPr>
+        <w:tabs>
+          <w:tab w:val="num" w:pos="5760"/>
+        </w:tabs>
+        <w:ind w:left="5760" w:hanging="360"/>
+      </w:pPr>
+      <w:rPr>
+        <w:rFonts w:ascii="Wingdings" w:hAnsi="Wingdings" w:hint="default"/>
+        <w:sz w:val="20"/>
+      </w:rPr>
+    </w:lvl>
+    <w:lvl w:ilvl="8" w:tentative="1">
+      <w:start w:val="1"/>
+      <w:numFmt w:val="bullet"/>
+      <w:lvlText w:val=""/>
+      <w:lvlJc w:val="left"/>
+      <w:pPr>
+        <w:tabs>
+          <w:tab w:val="num" w:pos="6480"/>
+        </w:tabs>
+        <w:ind w:left="6480" w:hanging="360"/>
+      </w:pPr>
+      <w:rPr>
+        <w:rFonts w:ascii="Wingdings" w:hAnsi="Wingdings" w:hint="default"/>
+        <w:sz w:val="20"/>
+      </w:rPr>
+    </w:lvl>
+  </w:abstractNum>
+  <w:abstractNum w:abstractNumId="11" w15:restartNumberingAfterBreak="0">
+    <w:nsid w:val="5EB34230"/>
+    <w:multiLevelType w:val="multilevel"/>
+    <w:tmpl w:val="E9E6A8DC"/>
+    <w:lvl w:ilvl="0">
+      <w:start w:val="1"/>
+      <w:numFmt w:val="bullet"/>
+      <w:lvlText w:val=""/>
+      <w:lvlJc w:val="left"/>
+      <w:pPr>
+        <w:tabs>
+          <w:tab w:val="num" w:pos="720"/>
+        </w:tabs>
+        <w:ind w:left="720" w:hanging="360"/>
+      </w:pPr>
+      <w:rPr>
+        <w:rFonts w:ascii="Symbol" w:hAnsi="Symbol" w:hint="default"/>
+        <w:sz w:val="20"/>
+      </w:rPr>
+    </w:lvl>
+    <w:lvl w:ilvl="1" w:tentative="1">
+      <w:start w:val="1"/>
+      <w:numFmt w:val="bullet"/>
+      <w:lvlText w:val="o"/>
+      <w:lvlJc w:val="left"/>
+      <w:pPr>
+        <w:tabs>
+          <w:tab w:val="num" w:pos="1440"/>
+        </w:tabs>
+        <w:ind w:left="1440" w:hanging="360"/>
+      </w:pPr>
+      <w:rPr>
+        <w:rFonts w:ascii="Courier New" w:hAnsi="Courier New" w:hint="default"/>
+        <w:sz w:val="20"/>
+      </w:rPr>
+    </w:lvl>
+    <w:lvl w:ilvl="2" w:tentative="1">
+      <w:start w:val="1"/>
+      <w:numFmt w:val="bullet"/>
+      <w:lvlText w:val=""/>
+      <w:lvlJc w:val="left"/>
+      <w:pPr>
+        <w:tabs>
+          <w:tab w:val="num" w:pos="2160"/>
+        </w:tabs>
+        <w:ind w:left="2160" w:hanging="360"/>
+      </w:pPr>
+      <w:rPr>
+        <w:rFonts w:ascii="Wingdings" w:hAnsi="Wingdings" w:hint="default"/>
+        <w:sz w:val="20"/>
+      </w:rPr>
+    </w:lvl>
+    <w:lvl w:ilvl="3" w:tentative="1">
+      <w:start w:val="1"/>
+      <w:numFmt w:val="bullet"/>
+      <w:lvlText w:val=""/>
+      <w:lvlJc w:val="left"/>
+      <w:pPr>
+        <w:tabs>
+          <w:tab w:val="num" w:pos="2880"/>
+        </w:tabs>
+        <w:ind w:left="2880" w:hanging="360"/>
+      </w:pPr>
+      <w:rPr>
+        <w:rFonts w:ascii="Wingdings" w:hAnsi="Wingdings" w:hint="default"/>
+        <w:sz w:val="20"/>
+      </w:rPr>
+    </w:lvl>
+    <w:lvl w:ilvl="4" w:tentative="1">
+      <w:start w:val="1"/>
+      <w:numFmt w:val="bullet"/>
+      <w:lvlText w:val=""/>
+      <w:lvlJc w:val="left"/>
+      <w:pPr>
+        <w:tabs>
+          <w:tab w:val="num" w:pos="3600"/>
+        </w:tabs>
+        <w:ind w:left="3600" w:hanging="360"/>
+      </w:pPr>
+      <w:rPr>
+        <w:rFonts w:ascii="Wingdings" w:hAnsi="Wingdings" w:hint="default"/>
+        <w:sz w:val="20"/>
+      </w:rPr>
+    </w:lvl>
+    <w:lvl w:ilvl="5" w:tentative="1">
+      <w:start w:val="1"/>
+      <w:numFmt w:val="bullet"/>
+      <w:lvlText w:val=""/>
+      <w:lvlJc w:val="left"/>
+      <w:pPr>
+        <w:tabs>
+          <w:tab w:val="num" w:pos="4320"/>
+        </w:tabs>
+        <w:ind w:left="4320" w:hanging="360"/>
+      </w:pPr>
+      <w:rPr>
+        <w:rFonts w:ascii="Wingdings" w:hAnsi="Wingdings" w:hint="default"/>
+        <w:sz w:val="20"/>
+      </w:rPr>
+    </w:lvl>
+    <w:lvl w:ilvl="6" w:tentative="1">
+      <w:start w:val="1"/>
+      <w:numFmt w:val="bullet"/>
+      <w:lvlText w:val=""/>
+      <w:lvlJc w:val="left"/>
+      <w:pPr>
+        <w:tabs>
+          <w:tab w:val="num" w:pos="5040"/>
+        </w:tabs>
+        <w:ind w:left="5040" w:hanging="360"/>
+      </w:pPr>
+      <w:rPr>
+        <w:rFonts w:ascii="Wingdings" w:hAnsi="Wingdings" w:hint="default"/>
+        <w:sz w:val="20"/>
+      </w:rPr>
+    </w:lvl>
+    <w:lvl w:ilvl="7" w:tentative="1">
+      <w:start w:val="1"/>
+      <w:numFmt w:val="bullet"/>
+      <w:lvlText w:val=""/>
+      <w:lvlJc w:val="left"/>
+      <w:pPr>
+        <w:tabs>
+          <w:tab w:val="num" w:pos="5760"/>
+        </w:tabs>
+        <w:ind w:left="5760" w:hanging="360"/>
+      </w:pPr>
+      <w:rPr>
+        <w:rFonts w:ascii="Wingdings" w:hAnsi="Wingdings" w:hint="default"/>
+        <w:sz w:val="20"/>
+      </w:rPr>
+    </w:lvl>
+    <w:lvl w:ilvl="8" w:tentative="1">
+      <w:start w:val="1"/>
+      <w:numFmt w:val="bullet"/>
+      <w:lvlText w:val=""/>
+      <w:lvlJc w:val="left"/>
+      <w:pPr>
+        <w:tabs>
+          <w:tab w:val="num" w:pos="6480"/>
+        </w:tabs>
+        <w:ind w:left="6480" w:hanging="360"/>
+      </w:pPr>
+      <w:rPr>
+        <w:rFonts w:ascii="Wingdings" w:hAnsi="Wingdings" w:hint="default"/>
+        <w:sz w:val="20"/>
+      </w:rPr>
+    </w:lvl>
+  </w:abstractNum>
+  <w:abstractNum w:abstractNumId="12" w15:restartNumberingAfterBreak="0">
+    <w:nsid w:val="5F463A05"/>
+    <w:multiLevelType w:val="multilevel"/>
+    <w:tmpl w:val="4628C67C"/>
+    <w:lvl w:ilvl="0">
+      <w:start w:val="1"/>
+      <w:numFmt w:val="bullet"/>
+      <w:lvlText w:val=""/>
+      <w:lvlJc w:val="left"/>
+      <w:pPr>
+        <w:tabs>
+          <w:tab w:val="num" w:pos="720"/>
+        </w:tabs>
+        <w:ind w:left="720" w:hanging="360"/>
+      </w:pPr>
+      <w:rPr>
+        <w:rFonts w:ascii="Symbol" w:hAnsi="Symbol" w:hint="default"/>
+        <w:sz w:val="20"/>
+      </w:rPr>
+    </w:lvl>
+    <w:lvl w:ilvl="1" w:tentative="1">
+      <w:start w:val="1"/>
+      <w:numFmt w:val="bullet"/>
+      <w:lvlText w:val="o"/>
+      <w:lvlJc w:val="left"/>
+      <w:pPr>
+        <w:tabs>
+          <w:tab w:val="num" w:pos="1440"/>
+        </w:tabs>
+        <w:ind w:left="1440" w:hanging="360"/>
+      </w:pPr>
+      <w:rPr>
+        <w:rFonts w:ascii="Courier New" w:hAnsi="Courier New" w:hint="default"/>
+        <w:sz w:val="20"/>
+      </w:rPr>
+    </w:lvl>
+    <w:lvl w:ilvl="2" w:tentative="1">
+      <w:start w:val="1"/>
+      <w:numFmt w:val="bullet"/>
+      <w:lvlText w:val=""/>
+      <w:lvlJc w:val="left"/>
+      <w:pPr>
+        <w:tabs>
+          <w:tab w:val="num" w:pos="2160"/>
+        </w:tabs>
+        <w:ind w:left="2160" w:hanging="360"/>
+      </w:pPr>
+      <w:rPr>
+        <w:rFonts w:ascii="Wingdings" w:hAnsi="Wingdings" w:hint="default"/>
+        <w:sz w:val="20"/>
+      </w:rPr>
+    </w:lvl>
+    <w:lvl w:ilvl="3" w:tentative="1">
+      <w:start w:val="1"/>
+      <w:numFmt w:val="bullet"/>
+      <w:lvlText w:val=""/>
+      <w:lvlJc w:val="left"/>
+      <w:pPr>
+        <w:tabs>
+          <w:tab w:val="num" w:pos="2880"/>
+        </w:tabs>
+        <w:ind w:left="2880" w:hanging="360"/>
+      </w:pPr>
+      <w:rPr>
+        <w:rFonts w:ascii="Wingdings" w:hAnsi="Wingdings" w:hint="default"/>
+        <w:sz w:val="20"/>
+      </w:rPr>
+    </w:lvl>
+    <w:lvl w:ilvl="4" w:tentative="1">
+      <w:start w:val="1"/>
+      <w:numFmt w:val="bullet"/>
+      <w:lvlText w:val=""/>
+      <w:lvlJc w:val="left"/>
+      <w:pPr>
+        <w:tabs>
+          <w:tab w:val="num" w:pos="3600"/>
+        </w:tabs>
+        <w:ind w:left="3600" w:hanging="360"/>
+      </w:pPr>
+      <w:rPr>
+        <w:rFonts w:ascii="Wingdings" w:hAnsi="Wingdings" w:hint="default"/>
+        <w:sz w:val="20"/>
+      </w:rPr>
+    </w:lvl>
+    <w:lvl w:ilvl="5" w:tentative="1">
+      <w:start w:val="1"/>
+      <w:numFmt w:val="bullet"/>
+      <w:lvlText w:val=""/>
+      <w:lvlJc w:val="left"/>
+      <w:pPr>
+        <w:tabs>
+          <w:tab w:val="num" w:pos="4320"/>
+        </w:tabs>
+        <w:ind w:left="4320" w:hanging="360"/>
+      </w:pPr>
+      <w:rPr>
+        <w:rFonts w:ascii="Wingdings" w:hAnsi="Wingdings" w:hint="default"/>
+        <w:sz w:val="20"/>
+      </w:rPr>
+    </w:lvl>
+    <w:lvl w:ilvl="6" w:tentative="1">
+      <w:start w:val="1"/>
+      <w:numFmt w:val="bullet"/>
+      <w:lvlText w:val=""/>
+      <w:lvlJc w:val="left"/>
+      <w:pPr>
+        <w:tabs>
+          <w:tab w:val="num" w:pos="5040"/>
+        </w:tabs>
+        <w:ind w:left="5040" w:hanging="360"/>
+      </w:pPr>
+      <w:rPr>
+        <w:rFonts w:ascii="Wingdings" w:hAnsi="Wingdings" w:hint="default"/>
+        <w:sz w:val="20"/>
+      </w:rPr>
+    </w:lvl>
+    <w:lvl w:ilvl="7" w:tentative="1">
+      <w:start w:val="1"/>
+      <w:numFmt w:val="bullet"/>
+      <w:lvlText w:val=""/>
+      <w:lvlJc w:val="left"/>
+      <w:pPr>
+        <w:tabs>
+          <w:tab w:val="num" w:pos="5760"/>
+        </w:tabs>
+        <w:ind w:left="5760" w:hanging="360"/>
+      </w:pPr>
+      <w:rPr>
+        <w:rFonts w:ascii="Wingdings" w:hAnsi="Wingdings" w:hint="default"/>
+        <w:sz w:val="20"/>
+      </w:rPr>
+    </w:lvl>
+    <w:lvl w:ilvl="8" w:tentative="1">
+      <w:start w:val="1"/>
+      <w:numFmt w:val="bullet"/>
+      <w:lvlText w:val=""/>
+      <w:lvlJc w:val="left"/>
+      <w:pPr>
+        <w:tabs>
+          <w:tab w:val="num" w:pos="6480"/>
+        </w:tabs>
+        <w:ind w:left="6480" w:hanging="360"/>
+      </w:pPr>
+      <w:rPr>
+        <w:rFonts w:ascii="Wingdings" w:hAnsi="Wingdings" w:hint="default"/>
+        <w:sz w:val="20"/>
+      </w:rPr>
+    </w:lvl>
+  </w:abstractNum>
+  <w:abstractNum w:abstractNumId="13" w15:restartNumberingAfterBreak="0">
+    <w:nsid w:val="60254249"/>
+    <w:multiLevelType w:val="multilevel"/>
+    <w:tmpl w:val="716EF8B4"/>
+    <w:lvl w:ilvl="0">
+      <w:start w:val="1"/>
+      <w:numFmt w:val="bullet"/>
+      <w:lvlText w:val=""/>
+      <w:lvlJc w:val="left"/>
+      <w:pPr>
+        <w:tabs>
+          <w:tab w:val="num" w:pos="720"/>
+        </w:tabs>
+        <w:ind w:left="720" w:hanging="360"/>
+      </w:pPr>
+      <w:rPr>
+        <w:rFonts w:ascii="Symbol" w:hAnsi="Symbol" w:hint="default"/>
+        <w:sz w:val="20"/>
+      </w:rPr>
+    </w:lvl>
+    <w:lvl w:ilvl="1" w:tentative="1">
+      <w:start w:val="1"/>
+      <w:numFmt w:val="bullet"/>
+      <w:lvlText w:val="o"/>
+      <w:lvlJc w:val="left"/>
+      <w:pPr>
+        <w:tabs>
+          <w:tab w:val="num" w:pos="1440"/>
+        </w:tabs>
+        <w:ind w:left="1440" w:hanging="360"/>
+      </w:pPr>
+      <w:rPr>
+        <w:rFonts w:ascii="Courier New" w:hAnsi="Courier New" w:hint="default"/>
+        <w:sz w:val="20"/>
+      </w:rPr>
+    </w:lvl>
+    <w:lvl w:ilvl="2" w:tentative="1">
+      <w:start w:val="1"/>
+      <w:numFmt w:val="bullet"/>
+      <w:lvlText w:val=""/>
+      <w:lvlJc w:val="left"/>
+      <w:pPr>
+        <w:tabs>
+          <w:tab w:val="num" w:pos="2160"/>
+        </w:tabs>
+        <w:ind w:left="2160" w:hanging="360"/>
+      </w:pPr>
+      <w:rPr>
+        <w:rFonts w:ascii="Wingdings" w:hAnsi="Wingdings" w:hint="default"/>
+        <w:sz w:val="20"/>
+      </w:rPr>
+    </w:lvl>
+    <w:lvl w:ilvl="3" w:tentative="1">
+      <w:start w:val="1"/>
+      <w:numFmt w:val="bullet"/>
+      <w:lvlText w:val=""/>
+      <w:lvlJc w:val="left"/>
+      <w:pPr>
+        <w:tabs>
+          <w:tab w:val="num" w:pos="2880"/>
+        </w:tabs>
+        <w:ind w:left="2880" w:hanging="360"/>
+      </w:pPr>
+      <w:rPr>
+        <w:rFonts w:ascii="Wingdings" w:hAnsi="Wingdings" w:hint="default"/>
+        <w:sz w:val="20"/>
+      </w:rPr>
+    </w:lvl>
+    <w:lvl w:ilvl="4" w:tentative="1">
+      <w:start w:val="1"/>
+      <w:numFmt w:val="bullet"/>
+      <w:lvlText w:val=""/>
+      <w:lvlJc w:val="left"/>
+      <w:pPr>
+        <w:tabs>
+          <w:tab w:val="num" w:pos="3600"/>
+        </w:tabs>
+        <w:ind w:left="3600" w:hanging="360"/>
+      </w:pPr>
+      <w:rPr>
+        <w:rFonts w:ascii="Wingdings" w:hAnsi="Wingdings" w:hint="default"/>
+        <w:sz w:val="20"/>
+      </w:rPr>
+    </w:lvl>
+    <w:lvl w:ilvl="5" w:tentative="1">
+      <w:start w:val="1"/>
+      <w:numFmt w:val="bullet"/>
+      <w:lvlText w:val=""/>
+      <w:lvlJc w:val="left"/>
+      <w:pPr>
+        <w:tabs>
+          <w:tab w:val="num" w:pos="4320"/>
+        </w:tabs>
+        <w:ind w:left="4320" w:hanging="360"/>
+      </w:pPr>
+      <w:rPr>
+        <w:rFonts w:ascii="Wingdings" w:hAnsi="Wingdings" w:hint="default"/>
+        <w:sz w:val="20"/>
+      </w:rPr>
+    </w:lvl>
+    <w:lvl w:ilvl="6" w:tentative="1">
+      <w:start w:val="1"/>
+      <w:numFmt w:val="bullet"/>
+      <w:lvlText w:val=""/>
+      <w:lvlJc w:val="left"/>
+      <w:pPr>
+        <w:tabs>
+          <w:tab w:val="num" w:pos="5040"/>
+        </w:tabs>
+        <w:ind w:left="5040" w:hanging="360"/>
+      </w:pPr>
+      <w:rPr>
+        <w:rFonts w:ascii="Wingdings" w:hAnsi="Wingdings" w:hint="default"/>
+        <w:sz w:val="20"/>
+      </w:rPr>
+    </w:lvl>
+    <w:lvl w:ilvl="7" w:tentative="1">
+      <w:start w:val="1"/>
+      <w:numFmt w:val="bullet"/>
+      <w:lvlText w:val=""/>
+      <w:lvlJc w:val="left"/>
+      <w:pPr>
+        <w:tabs>
+          <w:tab w:val="num" w:pos="5760"/>
+        </w:tabs>
+        <w:ind w:left="5760" w:hanging="360"/>
+      </w:pPr>
+      <w:rPr>
+        <w:rFonts w:ascii="Wingdings" w:hAnsi="Wingdings" w:hint="default"/>
+        <w:sz w:val="20"/>
+      </w:rPr>
+    </w:lvl>
+    <w:lvl w:ilvl="8" w:tentative="1">
+      <w:start w:val="1"/>
+      <w:numFmt w:val="bullet"/>
+      <w:lvlText w:val=""/>
+      <w:lvlJc w:val="left"/>
+      <w:pPr>
+        <w:tabs>
+          <w:tab w:val="num" w:pos="6480"/>
+        </w:tabs>
+        <w:ind w:left="6480" w:hanging="360"/>
+      </w:pPr>
+      <w:rPr>
+        <w:rFonts w:ascii="Wingdings" w:hAnsi="Wingdings" w:hint="default"/>
+        <w:sz w:val="20"/>
+      </w:rPr>
+    </w:lvl>
+  </w:abstractNum>
+  <w:abstractNum w:abstractNumId="14" w15:restartNumberingAfterBreak="0">
+    <w:nsid w:val="6524501C"/>
+    <w:multiLevelType w:val="multilevel"/>
+    <w:tmpl w:val="F1143696"/>
+    <w:lvl w:ilvl="0">
+      <w:start w:val="1"/>
+      <w:numFmt w:val="bullet"/>
+      <w:lvlText w:val=""/>
+      <w:lvlJc w:val="left"/>
+      <w:pPr>
+        <w:tabs>
+          <w:tab w:val="num" w:pos="720"/>
+        </w:tabs>
+        <w:ind w:left="720" w:hanging="360"/>
+      </w:pPr>
+      <w:rPr>
+        <w:rFonts w:ascii="Symbol" w:hAnsi="Symbol" w:hint="default"/>
+        <w:sz w:val="20"/>
+      </w:rPr>
+    </w:lvl>
+    <w:lvl w:ilvl="1" w:tentative="1">
+      <w:start w:val="1"/>
+      <w:numFmt w:val="bullet"/>
+      <w:lvlText w:val="o"/>
+      <w:lvlJc w:val="left"/>
+      <w:pPr>
+        <w:tabs>
+          <w:tab w:val="num" w:pos="1440"/>
+        </w:tabs>
+        <w:ind w:left="1440" w:hanging="360"/>
+      </w:pPr>
+      <w:rPr>
+        <w:rFonts w:ascii="Courier New" w:hAnsi="Courier New" w:hint="default"/>
+        <w:sz w:val="20"/>
+      </w:rPr>
+    </w:lvl>
+    <w:lvl w:ilvl="2" w:tentative="1">
+      <w:start w:val="1"/>
+      <w:numFmt w:val="bullet"/>
+      <w:lvlText w:val=""/>
+      <w:lvlJc w:val="left"/>
+      <w:pPr>
+        <w:tabs>
+          <w:tab w:val="num" w:pos="2160"/>
+        </w:tabs>
+        <w:ind w:left="2160" w:hanging="360"/>
+      </w:pPr>
+      <w:rPr>
+        <w:rFonts w:ascii="Wingdings" w:hAnsi="Wingdings" w:hint="default"/>
+        <w:sz w:val="20"/>
+      </w:rPr>
+    </w:lvl>
+    <w:lvl w:ilvl="3" w:tentative="1">
+      <w:start w:val="1"/>
+      <w:numFmt w:val="bullet"/>
+      <w:lvlText w:val=""/>
+      <w:lvlJc w:val="left"/>
+      <w:pPr>
+        <w:tabs>
+          <w:tab w:val="num" w:pos="2880"/>
+        </w:tabs>
+        <w:ind w:left="2880" w:hanging="360"/>
+      </w:pPr>
+      <w:rPr>
+        <w:rFonts w:ascii="Wingdings" w:hAnsi="Wingdings" w:hint="default"/>
+        <w:sz w:val="20"/>
+      </w:rPr>
+    </w:lvl>
+    <w:lvl w:ilvl="4" w:tentative="1">
+      <w:start w:val="1"/>
+      <w:numFmt w:val="bullet"/>
+      <w:lvlText w:val=""/>
+      <w:lvlJc w:val="left"/>
+      <w:pPr>
+        <w:tabs>
+          <w:tab w:val="num" w:pos="3600"/>
+        </w:tabs>
+        <w:ind w:left="3600" w:hanging="360"/>
+      </w:pPr>
+      <w:rPr>
+        <w:rFonts w:ascii="Wingdings" w:hAnsi="Wingdings" w:hint="default"/>
+        <w:sz w:val="20"/>
+      </w:rPr>
+    </w:lvl>
+    <w:lvl w:ilvl="5" w:tentative="1">
+      <w:start w:val="1"/>
+      <w:numFmt w:val="bullet"/>
+      <w:lvlText w:val=""/>
+      <w:lvlJc w:val="left"/>
+      <w:pPr>
+        <w:tabs>
+          <w:tab w:val="num" w:pos="4320"/>
+        </w:tabs>
+        <w:ind w:left="4320" w:hanging="360"/>
+      </w:pPr>
+      <w:rPr>
+        <w:rFonts w:ascii="Wingdings" w:hAnsi="Wingdings" w:hint="default"/>
+        <w:sz w:val="20"/>
+      </w:rPr>
+    </w:lvl>
+    <w:lvl w:ilvl="6" w:tentative="1">
+      <w:start w:val="1"/>
+      <w:numFmt w:val="bullet"/>
+      <w:lvlText w:val=""/>
+      <w:lvlJc w:val="left"/>
+      <w:pPr>
+        <w:tabs>
+          <w:tab w:val="num" w:pos="5040"/>
+        </w:tabs>
+        <w:ind w:left="5040" w:hanging="360"/>
+      </w:pPr>
+      <w:rPr>
+        <w:rFonts w:ascii="Wingdings" w:hAnsi="Wingdings" w:hint="default"/>
+        <w:sz w:val="20"/>
+      </w:rPr>
+    </w:lvl>
+    <w:lvl w:ilvl="7" w:tentative="1">
+      <w:start w:val="1"/>
+      <w:numFmt w:val="bullet"/>
+      <w:lvlText w:val=""/>
+      <w:lvlJc w:val="left"/>
+      <w:pPr>
+        <w:tabs>
+          <w:tab w:val="num" w:pos="5760"/>
+        </w:tabs>
+        <w:ind w:left="5760" w:hanging="360"/>
+      </w:pPr>
+      <w:rPr>
+        <w:rFonts w:ascii="Wingdings" w:hAnsi="Wingdings" w:hint="default"/>
+        <w:sz w:val="20"/>
+      </w:rPr>
+    </w:lvl>
+    <w:lvl w:ilvl="8" w:tentative="1">
+      <w:start w:val="1"/>
+      <w:numFmt w:val="bullet"/>
+      <w:lvlText w:val=""/>
+      <w:lvlJc w:val="left"/>
+      <w:pPr>
+        <w:tabs>
+          <w:tab w:val="num" w:pos="6480"/>
+        </w:tabs>
+        <w:ind w:left="6480" w:hanging="360"/>
+      </w:pPr>
+      <w:rPr>
+        <w:rFonts w:ascii="Wingdings" w:hAnsi="Wingdings" w:hint="default"/>
+        <w:sz w:val="20"/>
+      </w:rPr>
+    </w:lvl>
+  </w:abstractNum>
+  <w:abstractNum w:abstractNumId="15" w15:restartNumberingAfterBreak="0">
+    <w:nsid w:val="6E835785"/>
+    <w:multiLevelType w:val="multilevel"/>
+    <w:tmpl w:val="7F34685E"/>
+    <w:lvl w:ilvl="0">
+      <w:start w:val="1"/>
+      <w:numFmt w:val="bullet"/>
+      <w:lvlText w:val=""/>
+      <w:lvlJc w:val="left"/>
+      <w:pPr>
+        <w:tabs>
+          <w:tab w:val="num" w:pos="720"/>
+        </w:tabs>
+        <w:ind w:left="720" w:hanging="360"/>
+      </w:pPr>
+      <w:rPr>
+        <w:rFonts w:ascii="Symbol" w:hAnsi="Symbol" w:hint="default"/>
+        <w:sz w:val="20"/>
+      </w:rPr>
+    </w:lvl>
+    <w:lvl w:ilvl="1" w:tentative="1">
+      <w:start w:val="1"/>
+      <w:numFmt w:val="bullet"/>
+      <w:lvlText w:val="o"/>
+      <w:lvlJc w:val="left"/>
+      <w:pPr>
+        <w:tabs>
+          <w:tab w:val="num" w:pos="1440"/>
+        </w:tabs>
+        <w:ind w:left="1440" w:hanging="360"/>
+      </w:pPr>
+      <w:rPr>
+        <w:rFonts w:ascii="Courier New" w:hAnsi="Courier New" w:hint="default"/>
+        <w:sz w:val="20"/>
+      </w:rPr>
+    </w:lvl>
+    <w:lvl w:ilvl="2" w:tentative="1">
+      <w:start w:val="1"/>
+      <w:numFmt w:val="bullet"/>
+      <w:lvlText w:val=""/>
+      <w:lvlJc w:val="left"/>
+      <w:pPr>
+        <w:tabs>
+          <w:tab w:val="num" w:pos="2160"/>
+        </w:tabs>
+        <w:ind w:left="2160" w:hanging="360"/>
+      </w:pPr>
+      <w:rPr>
+        <w:rFonts w:ascii="Wingdings" w:hAnsi="Wingdings" w:hint="default"/>
+        <w:sz w:val="20"/>
+      </w:rPr>
+    </w:lvl>
+    <w:lvl w:ilvl="3" w:tentative="1">
+      <w:start w:val="1"/>
+      <w:numFmt w:val="bullet"/>
+      <w:lvlText w:val=""/>
+      <w:lvlJc w:val="left"/>
+      <w:pPr>
+        <w:tabs>
+          <w:tab w:val="num" w:pos="2880"/>
+        </w:tabs>
+        <w:ind w:left="2880" w:hanging="360"/>
+      </w:pPr>
+      <w:rPr>
+        <w:rFonts w:ascii="Wingdings" w:hAnsi="Wingdings" w:hint="default"/>
+        <w:sz w:val="20"/>
+      </w:rPr>
+    </w:lvl>
+    <w:lvl w:ilvl="4" w:tentative="1">
+      <w:start w:val="1"/>
+      <w:numFmt w:val="bullet"/>
+      <w:lvlText w:val=""/>
+      <w:lvlJc w:val="left"/>
+      <w:pPr>
+        <w:tabs>
+          <w:tab w:val="num" w:pos="3600"/>
+        </w:tabs>
+        <w:ind w:left="3600" w:hanging="360"/>
+      </w:pPr>
+      <w:rPr>
+        <w:rFonts w:ascii="Wingdings" w:hAnsi="Wingdings" w:hint="default"/>
+        <w:sz w:val="20"/>
+      </w:rPr>
+    </w:lvl>
+    <w:lvl w:ilvl="5" w:tentative="1">
+      <w:start w:val="1"/>
+      <w:numFmt w:val="bullet"/>
+      <w:lvlText w:val=""/>
+      <w:lvlJc w:val="left"/>
+      <w:pPr>
+        <w:tabs>
+          <w:tab w:val="num" w:pos="4320"/>
+        </w:tabs>
+        <w:ind w:left="4320" w:hanging="360"/>
+      </w:pPr>
+      <w:rPr>
+        <w:rFonts w:ascii="Wingdings" w:hAnsi="Wingdings" w:hint="default"/>
+        <w:sz w:val="20"/>
+      </w:rPr>
+    </w:lvl>
+    <w:lvl w:ilvl="6" w:tentative="1">
+      <w:start w:val="1"/>
+      <w:numFmt w:val="bullet"/>
+      <w:lvlText w:val=""/>
+      <w:lvlJc w:val="left"/>
+      <w:pPr>
+        <w:tabs>
+          <w:tab w:val="num" w:pos="5040"/>
+        </w:tabs>
+        <w:ind w:left="5040" w:hanging="360"/>
+      </w:pPr>
+      <w:rPr>
+        <w:rFonts w:ascii="Wingdings" w:hAnsi="Wingdings" w:hint="default"/>
+        <w:sz w:val="20"/>
+      </w:rPr>
+    </w:lvl>
+    <w:lvl w:ilvl="7" w:tentative="1">
+      <w:start w:val="1"/>
+      <w:numFmt w:val="bullet"/>
+      <w:lvlText w:val=""/>
+      <w:lvlJc w:val="left"/>
+      <w:pPr>
+        <w:tabs>
+          <w:tab w:val="num" w:pos="5760"/>
+        </w:tabs>
+        <w:ind w:left="5760" w:hanging="360"/>
+      </w:pPr>
+      <w:rPr>
+        <w:rFonts w:ascii="Wingdings" w:hAnsi="Wingdings" w:hint="default"/>
+        <w:sz w:val="20"/>
+      </w:rPr>
+    </w:lvl>
+    <w:lvl w:ilvl="8" w:tentative="1">
+      <w:start w:val="1"/>
+      <w:numFmt w:val="bullet"/>
+      <w:lvlText w:val=""/>
+      <w:lvlJc w:val="left"/>
+      <w:pPr>
+        <w:tabs>
+          <w:tab w:val="num" w:pos="6480"/>
+        </w:tabs>
+        <w:ind w:left="6480" w:hanging="360"/>
+      </w:pPr>
+      <w:rPr>
+        <w:rFonts w:ascii="Wingdings" w:hAnsi="Wingdings" w:hint="default"/>
+        <w:sz w:val="20"/>
+      </w:rPr>
+    </w:lvl>
+  </w:abstractNum>
+  <w:abstractNum w:abstractNumId="16" w15:restartNumberingAfterBreak="0">
     <w:nsid w:val="724E677B"/>
     <w:multiLevelType w:val="hybridMultilevel"/>
     <w:tmpl w:val="4D0E8B98"/>
@@ -5396,11 +8148,360 @@
       </w:rPr>
     </w:lvl>
   </w:abstractNum>
+  <w:abstractNum w:abstractNumId="17" w15:restartNumberingAfterBreak="0">
+    <w:nsid w:val="73E84DCF"/>
+    <w:multiLevelType w:val="multilevel"/>
+    <w:tmpl w:val="8640A71C"/>
+    <w:lvl w:ilvl="0">
+      <w:start w:val="1"/>
+      <w:numFmt w:val="bullet"/>
+      <w:lvlText w:val=""/>
+      <w:lvlJc w:val="left"/>
+      <w:pPr>
+        <w:tabs>
+          <w:tab w:val="num" w:pos="720"/>
+        </w:tabs>
+        <w:ind w:left="720" w:hanging="360"/>
+      </w:pPr>
+      <w:rPr>
+        <w:rFonts w:ascii="Symbol" w:hAnsi="Symbol" w:hint="default"/>
+        <w:sz w:val="20"/>
+      </w:rPr>
+    </w:lvl>
+    <w:lvl w:ilvl="1" w:tentative="1">
+      <w:start w:val="1"/>
+      <w:numFmt w:val="bullet"/>
+      <w:lvlText w:val="o"/>
+      <w:lvlJc w:val="left"/>
+      <w:pPr>
+        <w:tabs>
+          <w:tab w:val="num" w:pos="1440"/>
+        </w:tabs>
+        <w:ind w:left="1440" w:hanging="360"/>
+      </w:pPr>
+      <w:rPr>
+        <w:rFonts w:ascii="Courier New" w:hAnsi="Courier New" w:hint="default"/>
+        <w:sz w:val="20"/>
+      </w:rPr>
+    </w:lvl>
+    <w:lvl w:ilvl="2" w:tentative="1">
+      <w:start w:val="1"/>
+      <w:numFmt w:val="bullet"/>
+      <w:lvlText w:val=""/>
+      <w:lvlJc w:val="left"/>
+      <w:pPr>
+        <w:tabs>
+          <w:tab w:val="num" w:pos="2160"/>
+        </w:tabs>
+        <w:ind w:left="2160" w:hanging="360"/>
+      </w:pPr>
+      <w:rPr>
+        <w:rFonts w:ascii="Wingdings" w:hAnsi="Wingdings" w:hint="default"/>
+        <w:sz w:val="20"/>
+      </w:rPr>
+    </w:lvl>
+    <w:lvl w:ilvl="3" w:tentative="1">
+      <w:start w:val="1"/>
+      <w:numFmt w:val="bullet"/>
+      <w:lvlText w:val=""/>
+      <w:lvlJc w:val="left"/>
+      <w:pPr>
+        <w:tabs>
+          <w:tab w:val="num" w:pos="2880"/>
+        </w:tabs>
+        <w:ind w:left="2880" w:hanging="360"/>
+      </w:pPr>
+      <w:rPr>
+        <w:rFonts w:ascii="Wingdings" w:hAnsi="Wingdings" w:hint="default"/>
+        <w:sz w:val="20"/>
+      </w:rPr>
+    </w:lvl>
+    <w:lvl w:ilvl="4" w:tentative="1">
+      <w:start w:val="1"/>
+      <w:numFmt w:val="bullet"/>
+      <w:lvlText w:val=""/>
+      <w:lvlJc w:val="left"/>
+      <w:pPr>
+        <w:tabs>
+          <w:tab w:val="num" w:pos="3600"/>
+        </w:tabs>
+        <w:ind w:left="3600" w:hanging="360"/>
+      </w:pPr>
+      <w:rPr>
+        <w:rFonts w:ascii="Wingdings" w:hAnsi="Wingdings" w:hint="default"/>
+        <w:sz w:val="20"/>
+      </w:rPr>
+    </w:lvl>
+    <w:lvl w:ilvl="5" w:tentative="1">
+      <w:start w:val="1"/>
+      <w:numFmt w:val="bullet"/>
+      <w:lvlText w:val=""/>
+      <w:lvlJc w:val="left"/>
+      <w:pPr>
+        <w:tabs>
+          <w:tab w:val="num" w:pos="4320"/>
+        </w:tabs>
+        <w:ind w:left="4320" w:hanging="360"/>
+      </w:pPr>
+      <w:rPr>
+        <w:rFonts w:ascii="Wingdings" w:hAnsi="Wingdings" w:hint="default"/>
+        <w:sz w:val="20"/>
+      </w:rPr>
+    </w:lvl>
+    <w:lvl w:ilvl="6" w:tentative="1">
+      <w:start w:val="1"/>
+      <w:numFmt w:val="bullet"/>
+      <w:lvlText w:val=""/>
+      <w:lvlJc w:val="left"/>
+      <w:pPr>
+        <w:tabs>
+          <w:tab w:val="num" w:pos="5040"/>
+        </w:tabs>
+        <w:ind w:left="5040" w:hanging="360"/>
+      </w:pPr>
+      <w:rPr>
+        <w:rFonts w:ascii="Wingdings" w:hAnsi="Wingdings" w:hint="default"/>
+        <w:sz w:val="20"/>
+      </w:rPr>
+    </w:lvl>
+    <w:lvl w:ilvl="7" w:tentative="1">
+      <w:start w:val="1"/>
+      <w:numFmt w:val="bullet"/>
+      <w:lvlText w:val=""/>
+      <w:lvlJc w:val="left"/>
+      <w:pPr>
+        <w:tabs>
+          <w:tab w:val="num" w:pos="5760"/>
+        </w:tabs>
+        <w:ind w:left="5760" w:hanging="360"/>
+      </w:pPr>
+      <w:rPr>
+        <w:rFonts w:ascii="Wingdings" w:hAnsi="Wingdings" w:hint="default"/>
+        <w:sz w:val="20"/>
+      </w:rPr>
+    </w:lvl>
+    <w:lvl w:ilvl="8" w:tentative="1">
+      <w:start w:val="1"/>
+      <w:numFmt w:val="bullet"/>
+      <w:lvlText w:val=""/>
+      <w:lvlJc w:val="left"/>
+      <w:pPr>
+        <w:tabs>
+          <w:tab w:val="num" w:pos="6480"/>
+        </w:tabs>
+        <w:ind w:left="6480" w:hanging="360"/>
+      </w:pPr>
+      <w:rPr>
+        <w:rFonts w:ascii="Wingdings" w:hAnsi="Wingdings" w:hint="default"/>
+        <w:sz w:val="20"/>
+      </w:rPr>
+    </w:lvl>
+  </w:abstractNum>
+  <w:abstractNum w:abstractNumId="18" w15:restartNumberingAfterBreak="0">
+    <w:nsid w:val="76FF739C"/>
+    <w:multiLevelType w:val="multilevel"/>
+    <w:tmpl w:val="0D085834"/>
+    <w:lvl w:ilvl="0">
+      <w:start w:val="1"/>
+      <w:numFmt w:val="bullet"/>
+      <w:lvlText w:val=""/>
+      <w:lvlJc w:val="left"/>
+      <w:pPr>
+        <w:tabs>
+          <w:tab w:val="num" w:pos="720"/>
+        </w:tabs>
+        <w:ind w:left="720" w:hanging="360"/>
+      </w:pPr>
+      <w:rPr>
+        <w:rFonts w:ascii="Symbol" w:hAnsi="Symbol" w:hint="default"/>
+        <w:sz w:val="20"/>
+      </w:rPr>
+    </w:lvl>
+    <w:lvl w:ilvl="1" w:tentative="1">
+      <w:start w:val="1"/>
+      <w:numFmt w:val="bullet"/>
+      <w:lvlText w:val="o"/>
+      <w:lvlJc w:val="left"/>
+      <w:pPr>
+        <w:tabs>
+          <w:tab w:val="num" w:pos="1440"/>
+        </w:tabs>
+        <w:ind w:left="1440" w:hanging="360"/>
+      </w:pPr>
+      <w:rPr>
+        <w:rFonts w:ascii="Courier New" w:hAnsi="Courier New" w:hint="default"/>
+        <w:sz w:val="20"/>
+      </w:rPr>
+    </w:lvl>
+    <w:lvl w:ilvl="2" w:tentative="1">
+      <w:start w:val="1"/>
+      <w:numFmt w:val="bullet"/>
+      <w:lvlText w:val=""/>
+      <w:lvlJc w:val="left"/>
+      <w:pPr>
+        <w:tabs>
+          <w:tab w:val="num" w:pos="2160"/>
+        </w:tabs>
+        <w:ind w:left="2160" w:hanging="360"/>
+      </w:pPr>
+      <w:rPr>
+        <w:rFonts w:ascii="Wingdings" w:hAnsi="Wingdings" w:hint="default"/>
+        <w:sz w:val="20"/>
+      </w:rPr>
+    </w:lvl>
+    <w:lvl w:ilvl="3" w:tentative="1">
+      <w:start w:val="1"/>
+      <w:numFmt w:val="bullet"/>
+      <w:lvlText w:val=""/>
+      <w:lvlJc w:val="left"/>
+      <w:pPr>
+        <w:tabs>
+          <w:tab w:val="num" w:pos="2880"/>
+        </w:tabs>
+        <w:ind w:left="2880" w:hanging="360"/>
+      </w:pPr>
+      <w:rPr>
+        <w:rFonts w:ascii="Wingdings" w:hAnsi="Wingdings" w:hint="default"/>
+        <w:sz w:val="20"/>
+      </w:rPr>
+    </w:lvl>
+    <w:lvl w:ilvl="4" w:tentative="1">
+      <w:start w:val="1"/>
+      <w:numFmt w:val="bullet"/>
+      <w:lvlText w:val=""/>
+      <w:lvlJc w:val="left"/>
+      <w:pPr>
+        <w:tabs>
+          <w:tab w:val="num" w:pos="3600"/>
+        </w:tabs>
+        <w:ind w:left="3600" w:hanging="360"/>
+      </w:pPr>
+      <w:rPr>
+        <w:rFonts w:ascii="Wingdings" w:hAnsi="Wingdings" w:hint="default"/>
+        <w:sz w:val="20"/>
+      </w:rPr>
+    </w:lvl>
+    <w:lvl w:ilvl="5" w:tentative="1">
+      <w:start w:val="1"/>
+      <w:numFmt w:val="bullet"/>
+      <w:lvlText w:val=""/>
+      <w:lvlJc w:val="left"/>
+      <w:pPr>
+        <w:tabs>
+          <w:tab w:val="num" w:pos="4320"/>
+        </w:tabs>
+        <w:ind w:left="4320" w:hanging="360"/>
+      </w:pPr>
+      <w:rPr>
+        <w:rFonts w:ascii="Wingdings" w:hAnsi="Wingdings" w:hint="default"/>
+        <w:sz w:val="20"/>
+      </w:rPr>
+    </w:lvl>
+    <w:lvl w:ilvl="6" w:tentative="1">
+      <w:start w:val="1"/>
+      <w:numFmt w:val="bullet"/>
+      <w:lvlText w:val=""/>
+      <w:lvlJc w:val="left"/>
+      <w:pPr>
+        <w:tabs>
+          <w:tab w:val="num" w:pos="5040"/>
+        </w:tabs>
+        <w:ind w:left="5040" w:hanging="360"/>
+      </w:pPr>
+      <w:rPr>
+        <w:rFonts w:ascii="Wingdings" w:hAnsi="Wingdings" w:hint="default"/>
+        <w:sz w:val="20"/>
+      </w:rPr>
+    </w:lvl>
+    <w:lvl w:ilvl="7" w:tentative="1">
+      <w:start w:val="1"/>
+      <w:numFmt w:val="bullet"/>
+      <w:lvlText w:val=""/>
+      <w:lvlJc w:val="left"/>
+      <w:pPr>
+        <w:tabs>
+          <w:tab w:val="num" w:pos="5760"/>
+        </w:tabs>
+        <w:ind w:left="5760" w:hanging="360"/>
+      </w:pPr>
+      <w:rPr>
+        <w:rFonts w:ascii="Wingdings" w:hAnsi="Wingdings" w:hint="default"/>
+        <w:sz w:val="20"/>
+      </w:rPr>
+    </w:lvl>
+    <w:lvl w:ilvl="8" w:tentative="1">
+      <w:start w:val="1"/>
+      <w:numFmt w:val="bullet"/>
+      <w:lvlText w:val=""/>
+      <w:lvlJc w:val="left"/>
+      <w:pPr>
+        <w:tabs>
+          <w:tab w:val="num" w:pos="6480"/>
+        </w:tabs>
+        <w:ind w:left="6480" w:hanging="360"/>
+      </w:pPr>
+      <w:rPr>
+        <w:rFonts w:ascii="Wingdings" w:hAnsi="Wingdings" w:hint="default"/>
+        <w:sz w:val="20"/>
+      </w:rPr>
+    </w:lvl>
+  </w:abstractNum>
   <w:num w:numId="1" w16cid:durableId="82772223">
+    <w:abstractNumId w:val="16"/>
+  </w:num>
+  <w:num w:numId="2" w16cid:durableId="1619144745">
+    <w:abstractNumId w:val="2"/>
+  </w:num>
+  <w:num w:numId="3" w16cid:durableId="1672490970">
+    <w:abstractNumId w:val="5"/>
+  </w:num>
+  <w:num w:numId="4" w16cid:durableId="594561362">
+    <w:abstractNumId w:val="0"/>
+  </w:num>
+  <w:num w:numId="5" w16cid:durableId="2107070368">
+    <w:abstractNumId w:val="4"/>
+  </w:num>
+  <w:num w:numId="6" w16cid:durableId="495345167">
+    <w:abstractNumId w:val="12"/>
+  </w:num>
+  <w:num w:numId="7" w16cid:durableId="1711343560">
+    <w:abstractNumId w:val="6"/>
+  </w:num>
+  <w:num w:numId="8" w16cid:durableId="554435696">
+    <w:abstractNumId w:val="7"/>
+  </w:num>
+  <w:num w:numId="9" w16cid:durableId="581716859">
+    <w:abstractNumId w:val="18"/>
+  </w:num>
+  <w:num w:numId="10" w16cid:durableId="1715885444">
+    <w:abstractNumId w:val="13"/>
+  </w:num>
+  <w:num w:numId="11" w16cid:durableId="1457259106">
+    <w:abstractNumId w:val="11"/>
+  </w:num>
+  <w:num w:numId="12" w16cid:durableId="771784593">
+    <w:abstractNumId w:val="15"/>
+  </w:num>
+  <w:num w:numId="13" w16cid:durableId="765729509">
+    <w:abstractNumId w:val="3"/>
+  </w:num>
+  <w:num w:numId="14" w16cid:durableId="939489015">
+    <w:abstractNumId w:val="17"/>
+  </w:num>
+  <w:num w:numId="15" w16cid:durableId="1116287662">
+    <w:abstractNumId w:val="8"/>
+  </w:num>
+  <w:num w:numId="16" w16cid:durableId="1527668713">
     <w:abstractNumId w:val="1"/>
   </w:num>
-  <w:num w:numId="2" w16cid:durableId="1619144745">
-    <w:abstractNumId w:val="0"/>
+  <w:num w:numId="17" w16cid:durableId="1307540833">
+    <w:abstractNumId w:val="9"/>
+  </w:num>
+  <w:num w:numId="18" w16cid:durableId="514656652">
+    <w:abstractNumId w:val="10"/>
+  </w:num>
+  <w:num w:numId="19" w16cid:durableId="1134297113">
+    <w:abstractNumId w:val="14"/>
   </w:num>
 </w:numbering>
 </file>
@@ -6008,7 +9109,6 @@
   <w:style w:type="character" w:default="1" w:styleId="Standardnpsmoodstavce">
     <w:name w:val="Default Paragraph Font"/>
     <w:uiPriority w:val="1"/>
-    <w:semiHidden/>
     <w:unhideWhenUsed/>
   </w:style>
   <w:style w:type="table" w:default="1" w:styleId="Normlntabulka">

</xml_diff>